<commit_message>
doc(rapport): Complétion de l'Introduction + Analyse
</commit_message>
<xml_diff>
--- a/docs/p_oo-rapport.docx
+++ b/docs/p_oo-rapport.docx
@@ -156,8 +156,10 @@
           <w:bCs w:val="0"/>
           <w:caps w:val="0"/>
           <w:noProof/>
-          <w:sz w:val="22"/>
-          <w:szCs w:val="22"/>
+          <w:kern w:val="2"/>
+          <w:sz w:val="24"/>
+          <w:szCs w:val="24"/>
+          <w14:ligatures w14:val="standardContextual"/>
         </w:rPr>
       </w:pPr>
       <w:r>
@@ -193,7 +195,7 @@
         </w:rPr>
         <w:fldChar w:fldCharType="separate"/>
       </w:r>
-      <w:hyperlink w:anchor="_Toc308526316" w:history="1">
+      <w:hyperlink w:anchor="_Toc240008381" w:history="1">
         <w:r>
           <w:rPr>
             <w:rStyle w:val="Lienhypertexte"/>
@@ -208,8 +210,10 @@
             <w:bCs w:val="0"/>
             <w:caps w:val="0"/>
             <w:noProof/>
-            <w:sz w:val="22"/>
-            <w:szCs w:val="22"/>
+            <w:kern w:val="2"/>
+            <w:sz w:val="24"/>
+            <w:szCs w:val="24"/>
+            <w14:ligatures w14:val="standardContextual"/>
           </w:rPr>
           <w:tab/>
         </w:r>
@@ -218,7 +222,7 @@
             <w:rStyle w:val="Lienhypertexte"/>
             <w:noProof/>
           </w:rPr>
-          <w:t>Spécifications</w:t>
+          <w:t>Planification Initiale</w:t>
         </w:r>
         <w:r>
           <w:rPr>
@@ -239,7 +243,7 @@
             <w:noProof/>
             <w:webHidden/>
           </w:rPr>
-          <w:instrText xml:space="preserve"> PAGEREF _Toc308526316 \h </w:instrText>
+          <w:instrText xml:space="preserve"> PAGEREF _Toc240008381 \h </w:instrText>
         </w:r>
         <w:r>
           <w:rPr>
@@ -260,1280 +264,6 @@
             <w:webHidden/>
           </w:rPr>
           <w:t>3</w:t>
-        </w:r>
-        <w:r>
-          <w:rPr>
-            <w:noProof/>
-            <w:webHidden/>
-          </w:rPr>
-          <w:fldChar w:fldCharType="end"/>
-        </w:r>
-      </w:hyperlink>
-    </w:p>
-    <w:p>
-      <w:pPr>
-        <w:pStyle w:val="TM2"/>
-        <w:tabs>
-          <w:tab w:val="left" w:pos="800"/>
-          <w:tab w:val="right" w:leader="dot" w:pos="9060"/>
-        </w:tabs>
-        <w:rPr>
-          <w:rFonts w:eastAsiaTheme="minorEastAsia" w:cstheme="minorBidi"/>
-          <w:smallCaps w:val="0"/>
-          <w:noProof/>
-          <w:sz w:val="22"/>
-          <w:szCs w:val="22"/>
-        </w:rPr>
-      </w:pPr>
-      <w:hyperlink w:anchor="_Toc308526317" w:history="1">
-        <w:r>
-          <w:rPr>
-            <w:rStyle w:val="Lienhypertexte"/>
-            <w:noProof/>
-          </w:rPr>
-          <w:t>1.1</w:t>
-        </w:r>
-        <w:r>
-          <w:rPr>
-            <w:rFonts w:eastAsiaTheme="minorEastAsia" w:cstheme="minorBidi"/>
-            <w:smallCaps w:val="0"/>
-            <w:noProof/>
-            <w:sz w:val="22"/>
-            <w:szCs w:val="22"/>
-          </w:rPr>
-          <w:tab/>
-        </w:r>
-        <w:r>
-          <w:rPr>
-            <w:rStyle w:val="Lienhypertexte"/>
-            <w:noProof/>
-          </w:rPr>
-          <w:t>Titre</w:t>
-        </w:r>
-        <w:r>
-          <w:rPr>
-            <w:noProof/>
-            <w:webHidden/>
-          </w:rPr>
-          <w:tab/>
-        </w:r>
-        <w:r>
-          <w:rPr>
-            <w:noProof/>
-            <w:webHidden/>
-          </w:rPr>
-          <w:fldChar w:fldCharType="begin"/>
-        </w:r>
-        <w:r>
-          <w:rPr>
-            <w:noProof/>
-            <w:webHidden/>
-          </w:rPr>
-          <w:instrText xml:space="preserve"> PAGEREF _Toc308526317 \h </w:instrText>
-        </w:r>
-        <w:r>
-          <w:rPr>
-            <w:noProof/>
-            <w:webHidden/>
-          </w:rPr>
-        </w:r>
-        <w:r>
-          <w:rPr>
-            <w:noProof/>
-            <w:webHidden/>
-          </w:rPr>
-          <w:fldChar w:fldCharType="separate"/>
-        </w:r>
-        <w:r>
-          <w:rPr>
-            <w:noProof/>
-            <w:webHidden/>
-          </w:rPr>
-          <w:t>3</w:t>
-        </w:r>
-        <w:r>
-          <w:rPr>
-            <w:noProof/>
-            <w:webHidden/>
-          </w:rPr>
-          <w:fldChar w:fldCharType="end"/>
-        </w:r>
-      </w:hyperlink>
-    </w:p>
-    <w:p>
-      <w:pPr>
-        <w:pStyle w:val="TM2"/>
-        <w:tabs>
-          <w:tab w:val="left" w:pos="800"/>
-          <w:tab w:val="right" w:leader="dot" w:pos="9060"/>
-        </w:tabs>
-        <w:rPr>
-          <w:rFonts w:eastAsiaTheme="minorEastAsia" w:cstheme="minorBidi"/>
-          <w:smallCaps w:val="0"/>
-          <w:noProof/>
-          <w:sz w:val="22"/>
-          <w:szCs w:val="22"/>
-        </w:rPr>
-      </w:pPr>
-      <w:hyperlink w:anchor="_Toc308526318" w:history="1">
-        <w:r>
-          <w:rPr>
-            <w:rStyle w:val="Lienhypertexte"/>
-            <w:noProof/>
-          </w:rPr>
-          <w:t>1.2</w:t>
-        </w:r>
-        <w:r>
-          <w:rPr>
-            <w:rFonts w:eastAsiaTheme="minorEastAsia" w:cstheme="minorBidi"/>
-            <w:smallCaps w:val="0"/>
-            <w:noProof/>
-            <w:sz w:val="22"/>
-            <w:szCs w:val="22"/>
-          </w:rPr>
-          <w:tab/>
-        </w:r>
-        <w:r>
-          <w:rPr>
-            <w:rStyle w:val="Lienhypertexte"/>
-            <w:noProof/>
-          </w:rPr>
-          <w:t>Description</w:t>
-        </w:r>
-        <w:r>
-          <w:rPr>
-            <w:noProof/>
-            <w:webHidden/>
-          </w:rPr>
-          <w:tab/>
-        </w:r>
-        <w:r>
-          <w:rPr>
-            <w:noProof/>
-            <w:webHidden/>
-          </w:rPr>
-          <w:fldChar w:fldCharType="begin"/>
-        </w:r>
-        <w:r>
-          <w:rPr>
-            <w:noProof/>
-            <w:webHidden/>
-          </w:rPr>
-          <w:instrText xml:space="preserve"> PAGEREF _Toc308526318 \h </w:instrText>
-        </w:r>
-        <w:r>
-          <w:rPr>
-            <w:noProof/>
-            <w:webHidden/>
-          </w:rPr>
-        </w:r>
-        <w:r>
-          <w:rPr>
-            <w:noProof/>
-            <w:webHidden/>
-          </w:rPr>
-          <w:fldChar w:fldCharType="separate"/>
-        </w:r>
-        <w:r>
-          <w:rPr>
-            <w:noProof/>
-            <w:webHidden/>
-          </w:rPr>
-          <w:t>3</w:t>
-        </w:r>
-        <w:r>
-          <w:rPr>
-            <w:noProof/>
-            <w:webHidden/>
-          </w:rPr>
-          <w:fldChar w:fldCharType="end"/>
-        </w:r>
-      </w:hyperlink>
-    </w:p>
-    <w:p>
-      <w:pPr>
-        <w:pStyle w:val="TM2"/>
-        <w:tabs>
-          <w:tab w:val="left" w:pos="800"/>
-          <w:tab w:val="right" w:leader="dot" w:pos="9060"/>
-        </w:tabs>
-        <w:rPr>
-          <w:rFonts w:eastAsiaTheme="minorEastAsia" w:cstheme="minorBidi"/>
-          <w:smallCaps w:val="0"/>
-          <w:noProof/>
-          <w:sz w:val="22"/>
-          <w:szCs w:val="22"/>
-        </w:rPr>
-      </w:pPr>
-      <w:hyperlink w:anchor="_Toc308526319" w:history="1">
-        <w:r>
-          <w:rPr>
-            <w:rStyle w:val="Lienhypertexte"/>
-            <w:noProof/>
-          </w:rPr>
-          <w:t>1.3</w:t>
-        </w:r>
-        <w:r>
-          <w:rPr>
-            <w:rFonts w:eastAsiaTheme="minorEastAsia" w:cstheme="minorBidi"/>
-            <w:smallCaps w:val="0"/>
-            <w:noProof/>
-            <w:sz w:val="22"/>
-            <w:szCs w:val="22"/>
-          </w:rPr>
-          <w:tab/>
-        </w:r>
-        <w:r>
-          <w:rPr>
-            <w:rStyle w:val="Lienhypertexte"/>
-            <w:noProof/>
-          </w:rPr>
-          <w:t>Matériel et logiciels à disposition</w:t>
-        </w:r>
-        <w:r>
-          <w:rPr>
-            <w:noProof/>
-            <w:webHidden/>
-          </w:rPr>
-          <w:tab/>
-        </w:r>
-        <w:r>
-          <w:rPr>
-            <w:noProof/>
-            <w:webHidden/>
-          </w:rPr>
-          <w:fldChar w:fldCharType="begin"/>
-        </w:r>
-        <w:r>
-          <w:rPr>
-            <w:noProof/>
-            <w:webHidden/>
-          </w:rPr>
-          <w:instrText xml:space="preserve"> PAGEREF _Toc308526319 \h </w:instrText>
-        </w:r>
-        <w:r>
-          <w:rPr>
-            <w:noProof/>
-            <w:webHidden/>
-          </w:rPr>
-        </w:r>
-        <w:r>
-          <w:rPr>
-            <w:noProof/>
-            <w:webHidden/>
-          </w:rPr>
-          <w:fldChar w:fldCharType="separate"/>
-        </w:r>
-        <w:r>
-          <w:rPr>
-            <w:noProof/>
-            <w:webHidden/>
-          </w:rPr>
-          <w:t>3</w:t>
-        </w:r>
-        <w:r>
-          <w:rPr>
-            <w:noProof/>
-            <w:webHidden/>
-          </w:rPr>
-          <w:fldChar w:fldCharType="end"/>
-        </w:r>
-      </w:hyperlink>
-    </w:p>
-    <w:p>
-      <w:pPr>
-        <w:pStyle w:val="TM2"/>
-        <w:tabs>
-          <w:tab w:val="left" w:pos="800"/>
-          <w:tab w:val="right" w:leader="dot" w:pos="9060"/>
-        </w:tabs>
-        <w:rPr>
-          <w:rFonts w:eastAsiaTheme="minorEastAsia" w:cstheme="minorBidi"/>
-          <w:smallCaps w:val="0"/>
-          <w:noProof/>
-          <w:sz w:val="22"/>
-          <w:szCs w:val="22"/>
-        </w:rPr>
-      </w:pPr>
-      <w:hyperlink w:anchor="_Toc308526320" w:history="1">
-        <w:r>
-          <w:rPr>
-            <w:rStyle w:val="Lienhypertexte"/>
-            <w:noProof/>
-          </w:rPr>
-          <w:t>1.4</w:t>
-        </w:r>
-        <w:r>
-          <w:rPr>
-            <w:rFonts w:eastAsiaTheme="minorEastAsia" w:cstheme="minorBidi"/>
-            <w:smallCaps w:val="0"/>
-            <w:noProof/>
-            <w:sz w:val="22"/>
-            <w:szCs w:val="22"/>
-          </w:rPr>
-          <w:tab/>
-        </w:r>
-        <w:r>
-          <w:rPr>
-            <w:rStyle w:val="Lienhypertexte"/>
-            <w:noProof/>
-          </w:rPr>
-          <w:t>Prérequis</w:t>
-        </w:r>
-        <w:r>
-          <w:rPr>
-            <w:noProof/>
-            <w:webHidden/>
-          </w:rPr>
-          <w:tab/>
-        </w:r>
-        <w:r>
-          <w:rPr>
-            <w:noProof/>
-            <w:webHidden/>
-          </w:rPr>
-          <w:fldChar w:fldCharType="begin"/>
-        </w:r>
-        <w:r>
-          <w:rPr>
-            <w:noProof/>
-            <w:webHidden/>
-          </w:rPr>
-          <w:instrText xml:space="preserve"> PAGEREF _Toc308526320 \h </w:instrText>
-        </w:r>
-        <w:r>
-          <w:rPr>
-            <w:noProof/>
-            <w:webHidden/>
-          </w:rPr>
-        </w:r>
-        <w:r>
-          <w:rPr>
-            <w:noProof/>
-            <w:webHidden/>
-          </w:rPr>
-          <w:fldChar w:fldCharType="separate"/>
-        </w:r>
-        <w:r>
-          <w:rPr>
-            <w:noProof/>
-            <w:webHidden/>
-          </w:rPr>
-          <w:t>3</w:t>
-        </w:r>
-        <w:r>
-          <w:rPr>
-            <w:noProof/>
-            <w:webHidden/>
-          </w:rPr>
-          <w:fldChar w:fldCharType="end"/>
-        </w:r>
-      </w:hyperlink>
-    </w:p>
-    <w:p>
-      <w:pPr>
-        <w:pStyle w:val="TM2"/>
-        <w:tabs>
-          <w:tab w:val="left" w:pos="800"/>
-          <w:tab w:val="right" w:leader="dot" w:pos="9060"/>
-        </w:tabs>
-        <w:rPr>
-          <w:rFonts w:eastAsiaTheme="minorEastAsia" w:cstheme="minorBidi"/>
-          <w:smallCaps w:val="0"/>
-          <w:noProof/>
-          <w:sz w:val="22"/>
-          <w:szCs w:val="22"/>
-        </w:rPr>
-      </w:pPr>
-      <w:hyperlink w:anchor="_Toc308526321" w:history="1">
-        <w:r>
-          <w:rPr>
-            <w:rStyle w:val="Lienhypertexte"/>
-            <w:noProof/>
-          </w:rPr>
-          <w:t>1.5</w:t>
-        </w:r>
-        <w:r>
-          <w:rPr>
-            <w:rFonts w:eastAsiaTheme="minorEastAsia" w:cstheme="minorBidi"/>
-            <w:smallCaps w:val="0"/>
-            <w:noProof/>
-            <w:sz w:val="22"/>
-            <w:szCs w:val="22"/>
-          </w:rPr>
-          <w:tab/>
-        </w:r>
-        <w:r>
-          <w:rPr>
-            <w:rStyle w:val="Lienhypertexte"/>
-            <w:noProof/>
-          </w:rPr>
-          <w:t>Cahier des charges</w:t>
-        </w:r>
-        <w:r>
-          <w:rPr>
-            <w:noProof/>
-            <w:webHidden/>
-          </w:rPr>
-          <w:tab/>
-        </w:r>
-        <w:r>
-          <w:rPr>
-            <w:noProof/>
-            <w:webHidden/>
-          </w:rPr>
-          <w:fldChar w:fldCharType="begin"/>
-        </w:r>
-        <w:r>
-          <w:rPr>
-            <w:noProof/>
-            <w:webHidden/>
-          </w:rPr>
-          <w:instrText xml:space="preserve"> PAGEREF _Toc308526321 \h </w:instrText>
-        </w:r>
-        <w:r>
-          <w:rPr>
-            <w:noProof/>
-            <w:webHidden/>
-          </w:rPr>
-        </w:r>
-        <w:r>
-          <w:rPr>
-            <w:noProof/>
-            <w:webHidden/>
-          </w:rPr>
-          <w:fldChar w:fldCharType="separate"/>
-        </w:r>
-        <w:r>
-          <w:rPr>
-            <w:noProof/>
-            <w:webHidden/>
-          </w:rPr>
-          <w:t>3</w:t>
-        </w:r>
-        <w:r>
-          <w:rPr>
-            <w:noProof/>
-            <w:webHidden/>
-          </w:rPr>
-          <w:fldChar w:fldCharType="end"/>
-        </w:r>
-      </w:hyperlink>
-    </w:p>
-    <w:p>
-      <w:pPr>
-        <w:pStyle w:val="TM3"/>
-        <w:tabs>
-          <w:tab w:val="left" w:pos="1200"/>
-          <w:tab w:val="right" w:leader="dot" w:pos="9060"/>
-        </w:tabs>
-        <w:rPr>
-          <w:rFonts w:eastAsiaTheme="minorEastAsia" w:cstheme="minorBidi"/>
-          <w:i w:val="0"/>
-          <w:iCs w:val="0"/>
-          <w:noProof/>
-          <w:sz w:val="22"/>
-          <w:szCs w:val="22"/>
-        </w:rPr>
-      </w:pPr>
-      <w:hyperlink w:anchor="_Toc308526322" w:history="1">
-        <w:r>
-          <w:rPr>
-            <w:rStyle w:val="Lienhypertexte"/>
-            <w:noProof/>
-          </w:rPr>
-          <w:t>1.5.1</w:t>
-        </w:r>
-        <w:r>
-          <w:rPr>
-            <w:rFonts w:eastAsiaTheme="minorEastAsia" w:cstheme="minorBidi"/>
-            <w:i w:val="0"/>
-            <w:iCs w:val="0"/>
-            <w:noProof/>
-            <w:sz w:val="22"/>
-            <w:szCs w:val="22"/>
-          </w:rPr>
-          <w:tab/>
-        </w:r>
-        <w:r>
-          <w:rPr>
-            <w:rStyle w:val="Lienhypertexte"/>
-            <w:noProof/>
-          </w:rPr>
-          <w:t>Objectifs et portée du projet (objectifs SMART)</w:t>
-        </w:r>
-        <w:r>
-          <w:rPr>
-            <w:noProof/>
-            <w:webHidden/>
-          </w:rPr>
-          <w:tab/>
-        </w:r>
-        <w:r>
-          <w:rPr>
-            <w:noProof/>
-            <w:webHidden/>
-          </w:rPr>
-          <w:fldChar w:fldCharType="begin"/>
-        </w:r>
-        <w:r>
-          <w:rPr>
-            <w:noProof/>
-            <w:webHidden/>
-          </w:rPr>
-          <w:instrText xml:space="preserve"> PAGEREF _Toc308526322 \h </w:instrText>
-        </w:r>
-        <w:r>
-          <w:rPr>
-            <w:noProof/>
-            <w:webHidden/>
-          </w:rPr>
-        </w:r>
-        <w:r>
-          <w:rPr>
-            <w:noProof/>
-            <w:webHidden/>
-          </w:rPr>
-          <w:fldChar w:fldCharType="separate"/>
-        </w:r>
-        <w:r>
-          <w:rPr>
-            <w:noProof/>
-            <w:webHidden/>
-          </w:rPr>
-          <w:t>3</w:t>
-        </w:r>
-        <w:r>
-          <w:rPr>
-            <w:noProof/>
-            <w:webHidden/>
-          </w:rPr>
-          <w:fldChar w:fldCharType="end"/>
-        </w:r>
-      </w:hyperlink>
-    </w:p>
-    <w:p>
-      <w:pPr>
-        <w:pStyle w:val="TM3"/>
-        <w:tabs>
-          <w:tab w:val="left" w:pos="1200"/>
-          <w:tab w:val="right" w:leader="dot" w:pos="9060"/>
-        </w:tabs>
-        <w:rPr>
-          <w:rFonts w:eastAsiaTheme="minorEastAsia" w:cstheme="minorBidi"/>
-          <w:i w:val="0"/>
-          <w:iCs w:val="0"/>
-          <w:noProof/>
-          <w:sz w:val="22"/>
-          <w:szCs w:val="22"/>
-        </w:rPr>
-      </w:pPr>
-      <w:hyperlink w:anchor="_Toc308526323" w:history="1">
-        <w:r>
-          <w:rPr>
-            <w:rStyle w:val="Lienhypertexte"/>
-            <w:noProof/>
-          </w:rPr>
-          <w:t>1.5.2</w:t>
-        </w:r>
-        <w:r>
-          <w:rPr>
-            <w:rFonts w:eastAsiaTheme="minorEastAsia" w:cstheme="minorBidi"/>
-            <w:i w:val="0"/>
-            <w:iCs w:val="0"/>
-            <w:noProof/>
-            <w:sz w:val="22"/>
-            <w:szCs w:val="22"/>
-          </w:rPr>
-          <w:tab/>
-        </w:r>
-        <w:r>
-          <w:rPr>
-            <w:rStyle w:val="Lienhypertexte"/>
-            <w:noProof/>
-          </w:rPr>
-          <w:t>Caractéristiques des utilisateurs et impacts</w:t>
-        </w:r>
-        <w:r>
-          <w:rPr>
-            <w:noProof/>
-            <w:webHidden/>
-          </w:rPr>
-          <w:tab/>
-        </w:r>
-        <w:r>
-          <w:rPr>
-            <w:noProof/>
-            <w:webHidden/>
-          </w:rPr>
-          <w:fldChar w:fldCharType="begin"/>
-        </w:r>
-        <w:r>
-          <w:rPr>
-            <w:noProof/>
-            <w:webHidden/>
-          </w:rPr>
-          <w:instrText xml:space="preserve"> PAGEREF _Toc308526323 \h </w:instrText>
-        </w:r>
-        <w:r>
-          <w:rPr>
-            <w:noProof/>
-            <w:webHidden/>
-          </w:rPr>
-        </w:r>
-        <w:r>
-          <w:rPr>
-            <w:noProof/>
-            <w:webHidden/>
-          </w:rPr>
-          <w:fldChar w:fldCharType="separate"/>
-        </w:r>
-        <w:r>
-          <w:rPr>
-            <w:noProof/>
-            <w:webHidden/>
-          </w:rPr>
-          <w:t>3</w:t>
-        </w:r>
-        <w:r>
-          <w:rPr>
-            <w:noProof/>
-            <w:webHidden/>
-          </w:rPr>
-          <w:fldChar w:fldCharType="end"/>
-        </w:r>
-      </w:hyperlink>
-    </w:p>
-    <w:p>
-      <w:pPr>
-        <w:pStyle w:val="TM3"/>
-        <w:tabs>
-          <w:tab w:val="left" w:pos="1200"/>
-          <w:tab w:val="right" w:leader="dot" w:pos="9060"/>
-        </w:tabs>
-        <w:rPr>
-          <w:rFonts w:eastAsiaTheme="minorEastAsia" w:cstheme="minorBidi"/>
-          <w:i w:val="0"/>
-          <w:iCs w:val="0"/>
-          <w:noProof/>
-          <w:sz w:val="22"/>
-          <w:szCs w:val="22"/>
-        </w:rPr>
-      </w:pPr>
-      <w:hyperlink w:anchor="_Toc308526324" w:history="1">
-        <w:r>
-          <w:rPr>
-            <w:rStyle w:val="Lienhypertexte"/>
-            <w:noProof/>
-          </w:rPr>
-          <w:t>1.5.3</w:t>
-        </w:r>
-        <w:r>
-          <w:rPr>
-            <w:rFonts w:eastAsiaTheme="minorEastAsia" w:cstheme="minorBidi"/>
-            <w:i w:val="0"/>
-            <w:iCs w:val="0"/>
-            <w:noProof/>
-            <w:sz w:val="22"/>
-            <w:szCs w:val="22"/>
-          </w:rPr>
-          <w:tab/>
-        </w:r>
-        <w:r>
-          <w:rPr>
-            <w:rStyle w:val="Lienhypertexte"/>
-            <w:noProof/>
-          </w:rPr>
-          <w:t>Fonctionnalités requises (du point de vue de l’utilisateur)</w:t>
-        </w:r>
-        <w:r>
-          <w:rPr>
-            <w:noProof/>
-            <w:webHidden/>
-          </w:rPr>
-          <w:tab/>
-        </w:r>
-        <w:r>
-          <w:rPr>
-            <w:noProof/>
-            <w:webHidden/>
-          </w:rPr>
-          <w:fldChar w:fldCharType="begin"/>
-        </w:r>
-        <w:r>
-          <w:rPr>
-            <w:noProof/>
-            <w:webHidden/>
-          </w:rPr>
-          <w:instrText xml:space="preserve"> PAGEREF _Toc308526324 \h </w:instrText>
-        </w:r>
-        <w:r>
-          <w:rPr>
-            <w:noProof/>
-            <w:webHidden/>
-          </w:rPr>
-        </w:r>
-        <w:r>
-          <w:rPr>
-            <w:noProof/>
-            <w:webHidden/>
-          </w:rPr>
-          <w:fldChar w:fldCharType="separate"/>
-        </w:r>
-        <w:r>
-          <w:rPr>
-            <w:noProof/>
-            <w:webHidden/>
-          </w:rPr>
-          <w:t>3</w:t>
-        </w:r>
-        <w:r>
-          <w:rPr>
-            <w:noProof/>
-            <w:webHidden/>
-          </w:rPr>
-          <w:fldChar w:fldCharType="end"/>
-        </w:r>
-      </w:hyperlink>
-    </w:p>
-    <w:p>
-      <w:pPr>
-        <w:pStyle w:val="TM3"/>
-        <w:tabs>
-          <w:tab w:val="left" w:pos="1200"/>
-          <w:tab w:val="right" w:leader="dot" w:pos="9060"/>
-        </w:tabs>
-        <w:rPr>
-          <w:rFonts w:eastAsiaTheme="minorEastAsia" w:cstheme="minorBidi"/>
-          <w:i w:val="0"/>
-          <w:iCs w:val="0"/>
-          <w:noProof/>
-          <w:sz w:val="22"/>
-          <w:szCs w:val="22"/>
-        </w:rPr>
-      </w:pPr>
-      <w:hyperlink w:anchor="_Toc308526325" w:history="1">
-        <w:r>
-          <w:rPr>
-            <w:rStyle w:val="Lienhypertexte"/>
-            <w:noProof/>
-          </w:rPr>
-          <w:t>1.5.4</w:t>
-        </w:r>
-        <w:r>
-          <w:rPr>
-            <w:rFonts w:eastAsiaTheme="minorEastAsia" w:cstheme="minorBidi"/>
-            <w:i w:val="0"/>
-            <w:iCs w:val="0"/>
-            <w:noProof/>
-            <w:sz w:val="22"/>
-            <w:szCs w:val="22"/>
-          </w:rPr>
-          <w:tab/>
-        </w:r>
-        <w:r>
-          <w:rPr>
-            <w:rStyle w:val="Lienhypertexte"/>
-            <w:noProof/>
-          </w:rPr>
-          <w:t>Contraintes</w:t>
-        </w:r>
-        <w:r>
-          <w:rPr>
-            <w:noProof/>
-            <w:webHidden/>
-          </w:rPr>
-          <w:tab/>
-        </w:r>
-        <w:r>
-          <w:rPr>
-            <w:noProof/>
-            <w:webHidden/>
-          </w:rPr>
-          <w:fldChar w:fldCharType="begin"/>
-        </w:r>
-        <w:r>
-          <w:rPr>
-            <w:noProof/>
-            <w:webHidden/>
-          </w:rPr>
-          <w:instrText xml:space="preserve"> PAGEREF _Toc308526325 \h </w:instrText>
-        </w:r>
-        <w:r>
-          <w:rPr>
-            <w:noProof/>
-            <w:webHidden/>
-          </w:rPr>
-        </w:r>
-        <w:r>
-          <w:rPr>
-            <w:noProof/>
-            <w:webHidden/>
-          </w:rPr>
-          <w:fldChar w:fldCharType="separate"/>
-        </w:r>
-        <w:r>
-          <w:rPr>
-            <w:noProof/>
-            <w:webHidden/>
-          </w:rPr>
-          <w:t>3</w:t>
-        </w:r>
-        <w:r>
-          <w:rPr>
-            <w:noProof/>
-            <w:webHidden/>
-          </w:rPr>
-          <w:fldChar w:fldCharType="end"/>
-        </w:r>
-      </w:hyperlink>
-    </w:p>
-    <w:p>
-      <w:pPr>
-        <w:pStyle w:val="TM3"/>
-        <w:tabs>
-          <w:tab w:val="left" w:pos="1200"/>
-          <w:tab w:val="right" w:leader="dot" w:pos="9060"/>
-        </w:tabs>
-        <w:rPr>
-          <w:rFonts w:eastAsiaTheme="minorEastAsia" w:cstheme="minorBidi"/>
-          <w:i w:val="0"/>
-          <w:iCs w:val="0"/>
-          <w:noProof/>
-          <w:sz w:val="22"/>
-          <w:szCs w:val="22"/>
-        </w:rPr>
-      </w:pPr>
-      <w:hyperlink w:anchor="_Toc308526326" w:history="1">
-        <w:r>
-          <w:rPr>
-            <w:rStyle w:val="Lienhypertexte"/>
-            <w:noProof/>
-          </w:rPr>
-          <w:t>1.5.5</w:t>
-        </w:r>
-        <w:r>
-          <w:rPr>
-            <w:rFonts w:eastAsiaTheme="minorEastAsia" w:cstheme="minorBidi"/>
-            <w:i w:val="0"/>
-            <w:iCs w:val="0"/>
-            <w:noProof/>
-            <w:sz w:val="22"/>
-            <w:szCs w:val="22"/>
-          </w:rPr>
-          <w:tab/>
-        </w:r>
-        <w:r>
-          <w:rPr>
-            <w:rStyle w:val="Lienhypertexte"/>
-            <w:noProof/>
-          </w:rPr>
-          <w:t>Travail à réaliser par l'apprenti</w:t>
-        </w:r>
-        <w:r>
-          <w:rPr>
-            <w:noProof/>
-            <w:webHidden/>
-          </w:rPr>
-          <w:tab/>
-        </w:r>
-        <w:r>
-          <w:rPr>
-            <w:noProof/>
-            <w:webHidden/>
-          </w:rPr>
-          <w:fldChar w:fldCharType="begin"/>
-        </w:r>
-        <w:r>
-          <w:rPr>
-            <w:noProof/>
-            <w:webHidden/>
-          </w:rPr>
-          <w:instrText xml:space="preserve"> PAGEREF _Toc308526326 \h </w:instrText>
-        </w:r>
-        <w:r>
-          <w:rPr>
-            <w:noProof/>
-            <w:webHidden/>
-          </w:rPr>
-        </w:r>
-        <w:r>
-          <w:rPr>
-            <w:noProof/>
-            <w:webHidden/>
-          </w:rPr>
-          <w:fldChar w:fldCharType="separate"/>
-        </w:r>
-        <w:r>
-          <w:rPr>
-            <w:noProof/>
-            <w:webHidden/>
-          </w:rPr>
-          <w:t>4</w:t>
-        </w:r>
-        <w:r>
-          <w:rPr>
-            <w:noProof/>
-            <w:webHidden/>
-          </w:rPr>
-          <w:fldChar w:fldCharType="end"/>
-        </w:r>
-      </w:hyperlink>
-    </w:p>
-    <w:p>
-      <w:pPr>
-        <w:pStyle w:val="TM3"/>
-        <w:tabs>
-          <w:tab w:val="left" w:pos="1200"/>
-          <w:tab w:val="right" w:leader="dot" w:pos="9060"/>
-        </w:tabs>
-        <w:rPr>
-          <w:rFonts w:eastAsiaTheme="minorEastAsia" w:cstheme="minorBidi"/>
-          <w:i w:val="0"/>
-          <w:iCs w:val="0"/>
-          <w:noProof/>
-          <w:sz w:val="22"/>
-          <w:szCs w:val="22"/>
-        </w:rPr>
-      </w:pPr>
-      <w:hyperlink w:anchor="_Toc308526327" w:history="1">
-        <w:r>
-          <w:rPr>
-            <w:rStyle w:val="Lienhypertexte"/>
-            <w:noProof/>
-          </w:rPr>
-          <w:t>1.5.6</w:t>
-        </w:r>
-        <w:r>
-          <w:rPr>
-            <w:rFonts w:eastAsiaTheme="minorEastAsia" w:cstheme="minorBidi"/>
-            <w:i w:val="0"/>
-            <w:iCs w:val="0"/>
-            <w:noProof/>
-            <w:sz w:val="22"/>
-            <w:szCs w:val="22"/>
-          </w:rPr>
-          <w:tab/>
-        </w:r>
-        <w:r>
-          <w:rPr>
-            <w:rStyle w:val="Lienhypertexte"/>
-            <w:noProof/>
-          </w:rPr>
-          <w:t>Si le temps le permet …</w:t>
-        </w:r>
-        <w:r>
-          <w:rPr>
-            <w:noProof/>
-            <w:webHidden/>
-          </w:rPr>
-          <w:tab/>
-        </w:r>
-        <w:r>
-          <w:rPr>
-            <w:noProof/>
-            <w:webHidden/>
-          </w:rPr>
-          <w:fldChar w:fldCharType="begin"/>
-        </w:r>
-        <w:r>
-          <w:rPr>
-            <w:noProof/>
-            <w:webHidden/>
-          </w:rPr>
-          <w:instrText xml:space="preserve"> PAGEREF _Toc308526327 \h </w:instrText>
-        </w:r>
-        <w:r>
-          <w:rPr>
-            <w:noProof/>
-            <w:webHidden/>
-          </w:rPr>
-        </w:r>
-        <w:r>
-          <w:rPr>
-            <w:noProof/>
-            <w:webHidden/>
-          </w:rPr>
-          <w:fldChar w:fldCharType="separate"/>
-        </w:r>
-        <w:r>
-          <w:rPr>
-            <w:noProof/>
-            <w:webHidden/>
-          </w:rPr>
-          <w:t>4</w:t>
-        </w:r>
-        <w:r>
-          <w:rPr>
-            <w:noProof/>
-            <w:webHidden/>
-          </w:rPr>
-          <w:fldChar w:fldCharType="end"/>
-        </w:r>
-      </w:hyperlink>
-    </w:p>
-    <w:p>
-      <w:pPr>
-        <w:pStyle w:val="TM3"/>
-        <w:tabs>
-          <w:tab w:val="left" w:pos="1200"/>
-          <w:tab w:val="right" w:leader="dot" w:pos="9060"/>
-        </w:tabs>
-        <w:rPr>
-          <w:rFonts w:eastAsiaTheme="minorEastAsia" w:cstheme="minorBidi"/>
-          <w:i w:val="0"/>
-          <w:iCs w:val="0"/>
-          <w:noProof/>
-          <w:sz w:val="22"/>
-          <w:szCs w:val="22"/>
-        </w:rPr>
-      </w:pPr>
-      <w:hyperlink w:anchor="_Toc308526328" w:history="1">
-        <w:r>
-          <w:rPr>
-            <w:rStyle w:val="Lienhypertexte"/>
-            <w:noProof/>
-          </w:rPr>
-          <w:t>1.5.7</w:t>
-        </w:r>
-        <w:r>
-          <w:rPr>
-            <w:rFonts w:eastAsiaTheme="minorEastAsia" w:cstheme="minorBidi"/>
-            <w:i w:val="0"/>
-            <w:iCs w:val="0"/>
-            <w:noProof/>
-            <w:sz w:val="22"/>
-            <w:szCs w:val="22"/>
-          </w:rPr>
-          <w:tab/>
-        </w:r>
-        <w:r>
-          <w:rPr>
-            <w:rStyle w:val="Lienhypertexte"/>
-            <w:noProof/>
-          </w:rPr>
-          <w:t>Méthodes de validation des solutions</w:t>
-        </w:r>
-        <w:r>
-          <w:rPr>
-            <w:noProof/>
-            <w:webHidden/>
-          </w:rPr>
-          <w:tab/>
-        </w:r>
-        <w:r>
-          <w:rPr>
-            <w:noProof/>
-            <w:webHidden/>
-          </w:rPr>
-          <w:fldChar w:fldCharType="begin"/>
-        </w:r>
-        <w:r>
-          <w:rPr>
-            <w:noProof/>
-            <w:webHidden/>
-          </w:rPr>
-          <w:instrText xml:space="preserve"> PAGEREF _Toc308526328 \h </w:instrText>
-        </w:r>
-        <w:r>
-          <w:rPr>
-            <w:noProof/>
-            <w:webHidden/>
-          </w:rPr>
-        </w:r>
-        <w:r>
-          <w:rPr>
-            <w:noProof/>
-            <w:webHidden/>
-          </w:rPr>
-          <w:fldChar w:fldCharType="separate"/>
-        </w:r>
-        <w:r>
-          <w:rPr>
-            <w:noProof/>
-            <w:webHidden/>
-          </w:rPr>
-          <w:t>4</w:t>
-        </w:r>
-        <w:r>
-          <w:rPr>
-            <w:noProof/>
-            <w:webHidden/>
-          </w:rPr>
-          <w:fldChar w:fldCharType="end"/>
-        </w:r>
-      </w:hyperlink>
-    </w:p>
-    <w:p>
-      <w:pPr>
-        <w:pStyle w:val="TM2"/>
-        <w:tabs>
-          <w:tab w:val="left" w:pos="800"/>
-          <w:tab w:val="right" w:leader="dot" w:pos="9060"/>
-        </w:tabs>
-        <w:rPr>
-          <w:rFonts w:eastAsiaTheme="minorEastAsia" w:cstheme="minorBidi"/>
-          <w:smallCaps w:val="0"/>
-          <w:noProof/>
-          <w:sz w:val="22"/>
-          <w:szCs w:val="22"/>
-        </w:rPr>
-      </w:pPr>
-      <w:hyperlink w:anchor="_Toc308526329" w:history="1">
-        <w:r>
-          <w:rPr>
-            <w:rStyle w:val="Lienhypertexte"/>
-            <w:noProof/>
-          </w:rPr>
-          <w:t>1.6</w:t>
-        </w:r>
-        <w:r>
-          <w:rPr>
-            <w:rFonts w:eastAsiaTheme="minorEastAsia" w:cstheme="minorBidi"/>
-            <w:smallCaps w:val="0"/>
-            <w:noProof/>
-            <w:sz w:val="22"/>
-            <w:szCs w:val="22"/>
-          </w:rPr>
-          <w:tab/>
-        </w:r>
-        <w:r>
-          <w:rPr>
-            <w:rStyle w:val="Lienhypertexte"/>
-            <w:noProof/>
-          </w:rPr>
-          <w:t>Les points suivants seront évalués</w:t>
-        </w:r>
-        <w:r>
-          <w:rPr>
-            <w:noProof/>
-            <w:webHidden/>
-          </w:rPr>
-          <w:tab/>
-        </w:r>
-        <w:r>
-          <w:rPr>
-            <w:noProof/>
-            <w:webHidden/>
-          </w:rPr>
-          <w:fldChar w:fldCharType="begin"/>
-        </w:r>
-        <w:r>
-          <w:rPr>
-            <w:noProof/>
-            <w:webHidden/>
-          </w:rPr>
-          <w:instrText xml:space="preserve"> PAGEREF _Toc308526329 \h </w:instrText>
-        </w:r>
-        <w:r>
-          <w:rPr>
-            <w:noProof/>
-            <w:webHidden/>
-          </w:rPr>
-        </w:r>
-        <w:r>
-          <w:rPr>
-            <w:noProof/>
-            <w:webHidden/>
-          </w:rPr>
-          <w:fldChar w:fldCharType="separate"/>
-        </w:r>
-        <w:r>
-          <w:rPr>
-            <w:noProof/>
-            <w:webHidden/>
-          </w:rPr>
-          <w:t>4</w:t>
-        </w:r>
-        <w:r>
-          <w:rPr>
-            <w:noProof/>
-            <w:webHidden/>
-          </w:rPr>
-          <w:fldChar w:fldCharType="end"/>
-        </w:r>
-      </w:hyperlink>
-    </w:p>
-    <w:p>
-      <w:pPr>
-        <w:pStyle w:val="TM2"/>
-        <w:tabs>
-          <w:tab w:val="left" w:pos="800"/>
-          <w:tab w:val="right" w:leader="dot" w:pos="9060"/>
-        </w:tabs>
-        <w:rPr>
-          <w:rFonts w:eastAsiaTheme="minorEastAsia" w:cstheme="minorBidi"/>
-          <w:smallCaps w:val="0"/>
-          <w:noProof/>
-          <w:sz w:val="22"/>
-          <w:szCs w:val="22"/>
-        </w:rPr>
-      </w:pPr>
-      <w:hyperlink w:anchor="_Toc308526330" w:history="1">
-        <w:r>
-          <w:rPr>
-            <w:rStyle w:val="Lienhypertexte"/>
-            <w:noProof/>
-          </w:rPr>
-          <w:t>1.7</w:t>
-        </w:r>
-        <w:r>
-          <w:rPr>
-            <w:rFonts w:eastAsiaTheme="minorEastAsia" w:cstheme="minorBidi"/>
-            <w:smallCaps w:val="0"/>
-            <w:noProof/>
-            <w:sz w:val="22"/>
-            <w:szCs w:val="22"/>
-          </w:rPr>
-          <w:tab/>
-        </w:r>
-        <w:r>
-          <w:rPr>
-            <w:rStyle w:val="Lienhypertexte"/>
-            <w:noProof/>
-          </w:rPr>
-          <w:t>Validation et conditions de réussite</w:t>
-        </w:r>
-        <w:r>
-          <w:rPr>
-            <w:noProof/>
-            <w:webHidden/>
-          </w:rPr>
-          <w:tab/>
-        </w:r>
-        <w:r>
-          <w:rPr>
-            <w:noProof/>
-            <w:webHidden/>
-          </w:rPr>
-          <w:fldChar w:fldCharType="begin"/>
-        </w:r>
-        <w:r>
-          <w:rPr>
-            <w:noProof/>
-            <w:webHidden/>
-          </w:rPr>
-          <w:instrText xml:space="preserve"> PAGEREF _Toc308526330 \h </w:instrText>
-        </w:r>
-        <w:r>
-          <w:rPr>
-            <w:noProof/>
-            <w:webHidden/>
-          </w:rPr>
-        </w:r>
-        <w:r>
-          <w:rPr>
-            <w:noProof/>
-            <w:webHidden/>
-          </w:rPr>
-          <w:fldChar w:fldCharType="separate"/>
-        </w:r>
-        <w:r>
-          <w:rPr>
-            <w:noProof/>
-            <w:webHidden/>
-          </w:rPr>
-          <w:t>4</w:t>
         </w:r>
         <w:r>
           <w:rPr>
@@ -1557,11 +287,13 @@
           <w:bCs w:val="0"/>
           <w:caps w:val="0"/>
           <w:noProof/>
-          <w:sz w:val="22"/>
-          <w:szCs w:val="22"/>
+          <w:kern w:val="2"/>
+          <w:sz w:val="24"/>
+          <w:szCs w:val="24"/>
+          <w14:ligatures w14:val="standardContextual"/>
         </w:rPr>
       </w:pPr>
-      <w:hyperlink w:anchor="_Toc308526331" w:history="1">
+      <w:hyperlink w:anchor="_Toc240008382" w:history="1">
         <w:r>
           <w:rPr>
             <w:rStyle w:val="Lienhypertexte"/>
@@ -1576,8 +308,10 @@
             <w:bCs w:val="0"/>
             <w:caps w:val="0"/>
             <w:noProof/>
-            <w:sz w:val="22"/>
-            <w:szCs w:val="22"/>
+            <w:kern w:val="2"/>
+            <w:sz w:val="24"/>
+            <w:szCs w:val="24"/>
+            <w14:ligatures w14:val="standardContextual"/>
           </w:rPr>
           <w:tab/>
         </w:r>
@@ -1586,7 +320,7 @@
             <w:rStyle w:val="Lienhypertexte"/>
             <w:noProof/>
           </w:rPr>
-          <w:t>Planification Initiale</w:t>
+          <w:t>Analyse</w:t>
         </w:r>
         <w:r>
           <w:rPr>
@@ -1607,7 +341,7 @@
             <w:noProof/>
             <w:webHidden/>
           </w:rPr>
-          <w:instrText xml:space="preserve"> PAGEREF _Toc308526331 \h </w:instrText>
+          <w:instrText xml:space="preserve"> PAGEREF _Toc240008382 \h </w:instrText>
         </w:r>
         <w:r>
           <w:rPr>
@@ -1627,7 +361,7 @@
             <w:noProof/>
             <w:webHidden/>
           </w:rPr>
-          <w:t>4</w:t>
+          <w:t>3</w:t>
         </w:r>
         <w:r>
           <w:rPr>
@@ -1651,11 +385,13 @@
           <w:bCs w:val="0"/>
           <w:caps w:val="0"/>
           <w:noProof/>
-          <w:sz w:val="22"/>
-          <w:szCs w:val="22"/>
+          <w:kern w:val="2"/>
+          <w:sz w:val="24"/>
+          <w:szCs w:val="24"/>
+          <w14:ligatures w14:val="standardContextual"/>
         </w:rPr>
       </w:pPr>
-      <w:hyperlink w:anchor="_Toc308526332" w:history="1">
+      <w:hyperlink w:anchor="_Toc240008383" w:history="1">
         <w:r>
           <w:rPr>
             <w:rStyle w:val="Lienhypertexte"/>
@@ -1670,8 +406,10 @@
             <w:bCs w:val="0"/>
             <w:caps w:val="0"/>
             <w:noProof/>
-            <w:sz w:val="22"/>
-            <w:szCs w:val="22"/>
+            <w:kern w:val="2"/>
+            <w:sz w:val="24"/>
+            <w:szCs w:val="24"/>
+            <w14:ligatures w14:val="standardContextual"/>
           </w:rPr>
           <w:tab/>
         </w:r>
@@ -1680,7 +418,7 @@
             <w:rStyle w:val="Lienhypertexte"/>
             <w:noProof/>
           </w:rPr>
-          <w:t>Analyse</w:t>
+          <w:t>Réalisation</w:t>
         </w:r>
         <w:r>
           <w:rPr>
@@ -1701,7 +439,7 @@
             <w:noProof/>
             <w:webHidden/>
           </w:rPr>
-          <w:instrText xml:space="preserve"> PAGEREF _Toc308526332 \h </w:instrText>
+          <w:instrText xml:space="preserve"> PAGEREF _Toc240008383 \h </w:instrText>
         </w:r>
         <w:r>
           <w:rPr>
@@ -1721,7 +459,7 @@
             <w:noProof/>
             <w:webHidden/>
           </w:rPr>
-          <w:t>4</w:t>
+          <w:t>3</w:t>
         </w:r>
         <w:r>
           <w:rPr>
@@ -1743,11 +481,13 @@
           <w:rFonts w:eastAsiaTheme="minorEastAsia" w:cstheme="minorBidi"/>
           <w:smallCaps w:val="0"/>
           <w:noProof/>
-          <w:sz w:val="22"/>
-          <w:szCs w:val="22"/>
+          <w:kern w:val="2"/>
+          <w:sz w:val="24"/>
+          <w:szCs w:val="24"/>
+          <w14:ligatures w14:val="standardContextual"/>
         </w:rPr>
       </w:pPr>
-      <w:hyperlink w:anchor="_Toc308526333" w:history="1">
+      <w:hyperlink w:anchor="_Toc240008384" w:history="1">
         <w:r>
           <w:rPr>
             <w:rStyle w:val="Lienhypertexte"/>
@@ -1760,8 +500,10 @@
             <w:rFonts w:eastAsiaTheme="minorEastAsia" w:cstheme="minorBidi"/>
             <w:smallCaps w:val="0"/>
             <w:noProof/>
-            <w:sz w:val="22"/>
-            <w:szCs w:val="22"/>
+            <w:kern w:val="2"/>
+            <w:sz w:val="24"/>
+            <w:szCs w:val="24"/>
+            <w14:ligatures w14:val="standardContextual"/>
           </w:rPr>
           <w:tab/>
         </w:r>
@@ -1770,7 +512,7 @@
             <w:rStyle w:val="Lienhypertexte"/>
             <w:noProof/>
           </w:rPr>
-          <w:t>Opportunités</w:t>
+          <w:t>Dossier de Réalisation</w:t>
         </w:r>
         <w:r>
           <w:rPr>
@@ -1791,7 +533,7 @@
             <w:noProof/>
             <w:webHidden/>
           </w:rPr>
-          <w:instrText xml:space="preserve"> PAGEREF _Toc308526333 \h </w:instrText>
+          <w:instrText xml:space="preserve"> PAGEREF _Toc240008384 \h </w:instrText>
         </w:r>
         <w:r>
           <w:rPr>
@@ -1811,277 +553,7 @@
             <w:noProof/>
             <w:webHidden/>
           </w:rPr>
-          <w:t>4</w:t>
-        </w:r>
-        <w:r>
-          <w:rPr>
-            <w:noProof/>
-            <w:webHidden/>
-          </w:rPr>
-          <w:fldChar w:fldCharType="end"/>
-        </w:r>
-      </w:hyperlink>
-    </w:p>
-    <w:p>
-      <w:pPr>
-        <w:pStyle w:val="TM2"/>
-        <w:tabs>
-          <w:tab w:val="left" w:pos="800"/>
-          <w:tab w:val="right" w:leader="dot" w:pos="9060"/>
-        </w:tabs>
-        <w:rPr>
-          <w:rFonts w:eastAsiaTheme="minorEastAsia" w:cstheme="minorBidi"/>
-          <w:smallCaps w:val="0"/>
-          <w:noProof/>
-          <w:sz w:val="22"/>
-          <w:szCs w:val="22"/>
-        </w:rPr>
-      </w:pPr>
-      <w:hyperlink w:anchor="_Toc308526334" w:history="1">
-        <w:r>
-          <w:rPr>
-            <w:rStyle w:val="Lienhypertexte"/>
-            <w:noProof/>
-          </w:rPr>
-          <w:t>3.2</w:t>
-        </w:r>
-        <w:r>
-          <w:rPr>
-            <w:rFonts w:eastAsiaTheme="minorEastAsia" w:cstheme="minorBidi"/>
-            <w:smallCaps w:val="0"/>
-            <w:noProof/>
-            <w:sz w:val="22"/>
-            <w:szCs w:val="22"/>
-          </w:rPr>
-          <w:tab/>
-        </w:r>
-        <w:r>
-          <w:rPr>
-            <w:rStyle w:val="Lienhypertexte"/>
-            <w:noProof/>
-          </w:rPr>
-          <w:t>Document d’analyse et conception</w:t>
-        </w:r>
-        <w:r>
-          <w:rPr>
-            <w:noProof/>
-            <w:webHidden/>
-          </w:rPr>
-          <w:tab/>
-        </w:r>
-        <w:r>
-          <w:rPr>
-            <w:noProof/>
-            <w:webHidden/>
-          </w:rPr>
-          <w:fldChar w:fldCharType="begin"/>
-        </w:r>
-        <w:r>
-          <w:rPr>
-            <w:noProof/>
-            <w:webHidden/>
-          </w:rPr>
-          <w:instrText xml:space="preserve"> PAGEREF _Toc308526334 \h </w:instrText>
-        </w:r>
-        <w:r>
-          <w:rPr>
-            <w:noProof/>
-            <w:webHidden/>
-          </w:rPr>
-        </w:r>
-        <w:r>
-          <w:rPr>
-            <w:noProof/>
-            <w:webHidden/>
-          </w:rPr>
-          <w:fldChar w:fldCharType="separate"/>
-        </w:r>
-        <w:r>
-          <w:rPr>
-            <w:noProof/>
-            <w:webHidden/>
-          </w:rPr>
-          <w:t>4</w:t>
-        </w:r>
-        <w:r>
-          <w:rPr>
-            <w:noProof/>
-            <w:webHidden/>
-          </w:rPr>
-          <w:fldChar w:fldCharType="end"/>
-        </w:r>
-      </w:hyperlink>
-    </w:p>
-    <w:p>
-      <w:pPr>
-        <w:pStyle w:val="TM2"/>
-        <w:tabs>
-          <w:tab w:val="left" w:pos="800"/>
-          <w:tab w:val="right" w:leader="dot" w:pos="9060"/>
-        </w:tabs>
-        <w:rPr>
-          <w:rFonts w:eastAsiaTheme="minorEastAsia" w:cstheme="minorBidi"/>
-          <w:smallCaps w:val="0"/>
-          <w:noProof/>
-          <w:sz w:val="22"/>
-          <w:szCs w:val="22"/>
-        </w:rPr>
-      </w:pPr>
-      <w:hyperlink w:anchor="_Toc308526335" w:history="1">
-        <w:r>
-          <w:rPr>
-            <w:rStyle w:val="Lienhypertexte"/>
-            <w:noProof/>
-          </w:rPr>
-          <w:t>3.3</w:t>
-        </w:r>
-        <w:r>
-          <w:rPr>
-            <w:rFonts w:eastAsiaTheme="minorEastAsia" w:cstheme="minorBidi"/>
-            <w:smallCaps w:val="0"/>
-            <w:noProof/>
-            <w:sz w:val="22"/>
-            <w:szCs w:val="22"/>
-          </w:rPr>
-          <w:tab/>
-        </w:r>
-        <w:r>
-          <w:rPr>
-            <w:rStyle w:val="Lienhypertexte"/>
-            <w:noProof/>
-          </w:rPr>
-          <w:t>Conception des tests</w:t>
-        </w:r>
-        <w:r>
-          <w:rPr>
-            <w:noProof/>
-            <w:webHidden/>
-          </w:rPr>
-          <w:tab/>
-        </w:r>
-        <w:r>
-          <w:rPr>
-            <w:noProof/>
-            <w:webHidden/>
-          </w:rPr>
-          <w:fldChar w:fldCharType="begin"/>
-        </w:r>
-        <w:r>
-          <w:rPr>
-            <w:noProof/>
-            <w:webHidden/>
-          </w:rPr>
-          <w:instrText xml:space="preserve"> PAGEREF _Toc308526335 \h </w:instrText>
-        </w:r>
-        <w:r>
-          <w:rPr>
-            <w:noProof/>
-            <w:webHidden/>
-          </w:rPr>
-        </w:r>
-        <w:r>
-          <w:rPr>
-            <w:noProof/>
-            <w:webHidden/>
-          </w:rPr>
-          <w:fldChar w:fldCharType="separate"/>
-        </w:r>
-        <w:r>
-          <w:rPr>
-            <w:noProof/>
-            <w:webHidden/>
-          </w:rPr>
-          <w:t>5</w:t>
-        </w:r>
-        <w:r>
-          <w:rPr>
-            <w:noProof/>
-            <w:webHidden/>
-          </w:rPr>
-          <w:fldChar w:fldCharType="end"/>
-        </w:r>
-      </w:hyperlink>
-    </w:p>
-    <w:p>
-      <w:pPr>
-        <w:pStyle w:val="TM2"/>
-        <w:tabs>
-          <w:tab w:val="left" w:pos="800"/>
-          <w:tab w:val="right" w:leader="dot" w:pos="9060"/>
-        </w:tabs>
-        <w:rPr>
-          <w:rFonts w:eastAsiaTheme="minorEastAsia" w:cstheme="minorBidi"/>
-          <w:smallCaps w:val="0"/>
-          <w:noProof/>
-          <w:sz w:val="22"/>
-          <w:szCs w:val="22"/>
-        </w:rPr>
-      </w:pPr>
-      <w:hyperlink w:anchor="_Toc308526336" w:history="1">
-        <w:r>
-          <w:rPr>
-            <w:rStyle w:val="Lienhypertexte"/>
-            <w:noProof/>
-          </w:rPr>
-          <w:t>3.4</w:t>
-        </w:r>
-        <w:r>
-          <w:rPr>
-            <w:rFonts w:eastAsiaTheme="minorEastAsia" w:cstheme="minorBidi"/>
-            <w:smallCaps w:val="0"/>
-            <w:noProof/>
-            <w:sz w:val="22"/>
-            <w:szCs w:val="22"/>
-          </w:rPr>
-          <w:tab/>
-        </w:r>
-        <w:r>
-          <w:rPr>
-            <w:rStyle w:val="Lienhypertexte"/>
-            <w:noProof/>
-          </w:rPr>
-          <w:t>Planification détaillée</w:t>
-        </w:r>
-        <w:r>
-          <w:rPr>
-            <w:noProof/>
-            <w:webHidden/>
-          </w:rPr>
-          <w:tab/>
-        </w:r>
-        <w:r>
-          <w:rPr>
-            <w:noProof/>
-            <w:webHidden/>
-          </w:rPr>
-          <w:fldChar w:fldCharType="begin"/>
-        </w:r>
-        <w:r>
-          <w:rPr>
-            <w:noProof/>
-            <w:webHidden/>
-          </w:rPr>
-          <w:instrText xml:space="preserve"> PAGEREF _Toc308526336 \h </w:instrText>
-        </w:r>
-        <w:r>
-          <w:rPr>
-            <w:noProof/>
-            <w:webHidden/>
-          </w:rPr>
-        </w:r>
-        <w:r>
-          <w:rPr>
-            <w:noProof/>
-            <w:webHidden/>
-          </w:rPr>
-          <w:fldChar w:fldCharType="separate"/>
-        </w:r>
-        <w:r>
-          <w:rPr>
-            <w:noProof/>
-            <w:webHidden/>
-          </w:rPr>
-          <w:t>5</w:t>
+          <w:t>3</w:t>
         </w:r>
         <w:r>
           <w:rPr>
@@ -2105,11 +577,13 @@
           <w:bCs w:val="0"/>
           <w:caps w:val="0"/>
           <w:noProof/>
-          <w:sz w:val="22"/>
-          <w:szCs w:val="22"/>
+          <w:kern w:val="2"/>
+          <w:sz w:val="24"/>
+          <w:szCs w:val="24"/>
+          <w14:ligatures w14:val="standardContextual"/>
         </w:rPr>
       </w:pPr>
-      <w:hyperlink w:anchor="_Toc308526337" w:history="1">
+      <w:hyperlink w:anchor="_Toc240008385" w:history="1">
         <w:r>
           <w:rPr>
             <w:rStyle w:val="Lienhypertexte"/>
@@ -2124,8 +598,10 @@
             <w:bCs w:val="0"/>
             <w:caps w:val="0"/>
             <w:noProof/>
-            <w:sz w:val="22"/>
-            <w:szCs w:val="22"/>
+            <w:kern w:val="2"/>
+            <w:sz w:val="24"/>
+            <w:szCs w:val="24"/>
+            <w14:ligatures w14:val="standardContextual"/>
           </w:rPr>
           <w:tab/>
         </w:r>
@@ -2134,7 +610,7 @@
             <w:rStyle w:val="Lienhypertexte"/>
             <w:noProof/>
           </w:rPr>
-          <w:t>Réalisation</w:t>
+          <w:t>Tests</w:t>
         </w:r>
         <w:r>
           <w:rPr>
@@ -2155,7 +631,7 @@
             <w:noProof/>
             <w:webHidden/>
           </w:rPr>
-          <w:instrText xml:space="preserve"> PAGEREF _Toc308526337 \h </w:instrText>
+          <w:instrText xml:space="preserve"> PAGEREF _Toc240008385 \h </w:instrText>
         </w:r>
         <w:r>
           <w:rPr>
@@ -2175,7 +651,7 @@
             <w:noProof/>
             <w:webHidden/>
           </w:rPr>
-          <w:t>5</w:t>
+          <w:t>3</w:t>
         </w:r>
         <w:r>
           <w:rPr>
@@ -2197,11 +673,13 @@
           <w:rFonts w:eastAsiaTheme="minorEastAsia" w:cstheme="minorBidi"/>
           <w:smallCaps w:val="0"/>
           <w:noProof/>
-          <w:sz w:val="22"/>
-          <w:szCs w:val="22"/>
+          <w:kern w:val="2"/>
+          <w:sz w:val="24"/>
+          <w:szCs w:val="24"/>
+          <w14:ligatures w14:val="standardContextual"/>
         </w:rPr>
       </w:pPr>
-      <w:hyperlink w:anchor="_Toc308526338" w:history="1">
+      <w:hyperlink w:anchor="_Toc240008386" w:history="1">
         <w:r>
           <w:rPr>
             <w:rStyle w:val="Lienhypertexte"/>
@@ -2214,8 +692,10 @@
             <w:rFonts w:eastAsiaTheme="minorEastAsia" w:cstheme="minorBidi"/>
             <w:smallCaps w:val="0"/>
             <w:noProof/>
-            <w:sz w:val="22"/>
-            <w:szCs w:val="22"/>
+            <w:kern w:val="2"/>
+            <w:sz w:val="24"/>
+            <w:szCs w:val="24"/>
+            <w14:ligatures w14:val="standardContextual"/>
           </w:rPr>
           <w:tab/>
         </w:r>
@@ -2224,7 +704,7 @@
             <w:rStyle w:val="Lienhypertexte"/>
             <w:noProof/>
           </w:rPr>
-          <w:t>Dossier de Réalisation</w:t>
+          <w:t>Dossier des tests</w:t>
         </w:r>
         <w:r>
           <w:rPr>
@@ -2245,7 +725,7 @@
             <w:noProof/>
             <w:webHidden/>
           </w:rPr>
-          <w:instrText xml:space="preserve"> PAGEREF _Toc308526338 \h </w:instrText>
+          <w:instrText xml:space="preserve"> PAGEREF _Toc240008386 \h </w:instrText>
         </w:r>
         <w:r>
           <w:rPr>
@@ -2265,97 +745,7 @@
             <w:noProof/>
             <w:webHidden/>
           </w:rPr>
-          <w:t>5</w:t>
-        </w:r>
-        <w:r>
-          <w:rPr>
-            <w:noProof/>
-            <w:webHidden/>
-          </w:rPr>
-          <w:fldChar w:fldCharType="end"/>
-        </w:r>
-      </w:hyperlink>
-    </w:p>
-    <w:p>
-      <w:pPr>
-        <w:pStyle w:val="TM2"/>
-        <w:tabs>
-          <w:tab w:val="left" w:pos="800"/>
-          <w:tab w:val="right" w:leader="dot" w:pos="9060"/>
-        </w:tabs>
-        <w:rPr>
-          <w:rFonts w:eastAsiaTheme="minorEastAsia" w:cstheme="minorBidi"/>
-          <w:smallCaps w:val="0"/>
-          <w:noProof/>
-          <w:sz w:val="22"/>
-          <w:szCs w:val="22"/>
-        </w:rPr>
-      </w:pPr>
-      <w:hyperlink w:anchor="_Toc308526339" w:history="1">
-        <w:r>
-          <w:rPr>
-            <w:rStyle w:val="Lienhypertexte"/>
-            <w:noProof/>
-          </w:rPr>
-          <w:t>4.2</w:t>
-        </w:r>
-        <w:r>
-          <w:rPr>
-            <w:rFonts w:eastAsiaTheme="minorEastAsia" w:cstheme="minorBidi"/>
-            <w:smallCaps w:val="0"/>
-            <w:noProof/>
-            <w:sz w:val="22"/>
-            <w:szCs w:val="22"/>
-          </w:rPr>
-          <w:tab/>
-        </w:r>
-        <w:r>
-          <w:rPr>
-            <w:rStyle w:val="Lienhypertexte"/>
-            <w:noProof/>
-          </w:rPr>
-          <w:t>Modifications</w:t>
-        </w:r>
-        <w:r>
-          <w:rPr>
-            <w:noProof/>
-            <w:webHidden/>
-          </w:rPr>
-          <w:tab/>
-        </w:r>
-        <w:r>
-          <w:rPr>
-            <w:noProof/>
-            <w:webHidden/>
-          </w:rPr>
-          <w:fldChar w:fldCharType="begin"/>
-        </w:r>
-        <w:r>
-          <w:rPr>
-            <w:noProof/>
-            <w:webHidden/>
-          </w:rPr>
-          <w:instrText xml:space="preserve"> PAGEREF _Toc308526339 \h </w:instrText>
-        </w:r>
-        <w:r>
-          <w:rPr>
-            <w:noProof/>
-            <w:webHidden/>
-          </w:rPr>
-        </w:r>
-        <w:r>
-          <w:rPr>
-            <w:noProof/>
-            <w:webHidden/>
-          </w:rPr>
-          <w:fldChar w:fldCharType="separate"/>
-        </w:r>
-        <w:r>
-          <w:rPr>
-            <w:noProof/>
-            <w:webHidden/>
-          </w:rPr>
-          <w:t>5</w:t>
+          <w:t>3</w:t>
         </w:r>
         <w:r>
           <w:rPr>
@@ -2379,11 +769,13 @@
           <w:bCs w:val="0"/>
           <w:caps w:val="0"/>
           <w:noProof/>
-          <w:sz w:val="22"/>
-          <w:szCs w:val="22"/>
+          <w:kern w:val="2"/>
+          <w:sz w:val="24"/>
+          <w:szCs w:val="24"/>
+          <w14:ligatures w14:val="standardContextual"/>
         </w:rPr>
       </w:pPr>
-      <w:hyperlink w:anchor="_Toc308526340" w:history="1">
+      <w:hyperlink w:anchor="_Toc240008387" w:history="1">
         <w:r>
           <w:rPr>
             <w:rStyle w:val="Lienhypertexte"/>
@@ -2398,8 +790,10 @@
             <w:bCs w:val="0"/>
             <w:caps w:val="0"/>
             <w:noProof/>
-            <w:sz w:val="22"/>
-            <w:szCs w:val="22"/>
+            <w:kern w:val="2"/>
+            <w:sz w:val="24"/>
+            <w:szCs w:val="24"/>
+            <w14:ligatures w14:val="standardContextual"/>
           </w:rPr>
           <w:tab/>
         </w:r>
@@ -2408,7 +802,7 @@
             <w:rStyle w:val="Lienhypertexte"/>
             <w:noProof/>
           </w:rPr>
-          <w:t>Tests</w:t>
+          <w:t>Conclusion</w:t>
         </w:r>
         <w:r>
           <w:rPr>
@@ -2429,7 +823,7 @@
             <w:noProof/>
             <w:webHidden/>
           </w:rPr>
-          <w:instrText xml:space="preserve"> PAGEREF _Toc308526340 \h </w:instrText>
+          <w:instrText xml:space="preserve"> PAGEREF _Toc240008387 \h </w:instrText>
         </w:r>
         <w:r>
           <w:rPr>
@@ -2449,7 +843,7 @@
             <w:noProof/>
             <w:webHidden/>
           </w:rPr>
-          <w:t>5</w:t>
+          <w:t>3</w:t>
         </w:r>
         <w:r>
           <w:rPr>
@@ -2471,11 +865,13 @@
           <w:rFonts w:eastAsiaTheme="minorEastAsia" w:cstheme="minorBidi"/>
           <w:smallCaps w:val="0"/>
           <w:noProof/>
-          <w:sz w:val="22"/>
-          <w:szCs w:val="22"/>
+          <w:kern w:val="2"/>
+          <w:sz w:val="24"/>
+          <w:szCs w:val="24"/>
+          <w14:ligatures w14:val="standardContextual"/>
         </w:rPr>
       </w:pPr>
-      <w:hyperlink w:anchor="_Toc308526341" w:history="1">
+      <w:hyperlink w:anchor="_Toc240008388" w:history="1">
         <w:r>
           <w:rPr>
             <w:rStyle w:val="Lienhypertexte"/>
@@ -2488,8 +884,10 @@
             <w:rFonts w:eastAsiaTheme="minorEastAsia" w:cstheme="minorBidi"/>
             <w:smallCaps w:val="0"/>
             <w:noProof/>
-            <w:sz w:val="22"/>
-            <w:szCs w:val="22"/>
+            <w:kern w:val="2"/>
+            <w:sz w:val="24"/>
+            <w:szCs w:val="24"/>
+            <w14:ligatures w14:val="standardContextual"/>
           </w:rPr>
           <w:tab/>
         </w:r>
@@ -2498,7 +896,7 @@
             <w:rStyle w:val="Lienhypertexte"/>
             <w:noProof/>
           </w:rPr>
-          <w:t>Dossier des tests</w:t>
+          <w:t>Bilan des fonctionnalités demandées</w:t>
         </w:r>
         <w:r>
           <w:rPr>
@@ -2519,7 +917,7 @@
             <w:noProof/>
             <w:webHidden/>
           </w:rPr>
-          <w:instrText xml:space="preserve"> PAGEREF _Toc308526341 \h </w:instrText>
+          <w:instrText xml:space="preserve"> PAGEREF _Toc240008388 \h </w:instrText>
         </w:r>
         <w:r>
           <w:rPr>
@@ -2539,7 +937,195 @@
             <w:noProof/>
             <w:webHidden/>
           </w:rPr>
-          <w:t>5</w:t>
+          <w:t>3</w:t>
+        </w:r>
+        <w:r>
+          <w:rPr>
+            <w:noProof/>
+            <w:webHidden/>
+          </w:rPr>
+          <w:fldChar w:fldCharType="end"/>
+        </w:r>
+      </w:hyperlink>
+    </w:p>
+    <w:p>
+      <w:pPr>
+        <w:pStyle w:val="TM2"/>
+        <w:tabs>
+          <w:tab w:val="left" w:pos="800"/>
+          <w:tab w:val="right" w:leader="dot" w:pos="9060"/>
+        </w:tabs>
+        <w:rPr>
+          <w:rFonts w:eastAsiaTheme="minorEastAsia" w:cstheme="minorBidi"/>
+          <w:smallCaps w:val="0"/>
+          <w:noProof/>
+          <w:kern w:val="2"/>
+          <w:sz w:val="24"/>
+          <w:szCs w:val="24"/>
+          <w14:ligatures w14:val="standardContextual"/>
+        </w:rPr>
+      </w:pPr>
+      <w:hyperlink w:anchor="_Toc240008389" w:history="1">
+        <w:r>
+          <w:rPr>
+            <w:rStyle w:val="Lienhypertexte"/>
+            <w:noProof/>
+          </w:rPr>
+          <w:t>5.2</w:t>
+        </w:r>
+        <w:r>
+          <w:rPr>
+            <w:rFonts w:eastAsiaTheme="minorEastAsia" w:cstheme="minorBidi"/>
+            <w:smallCaps w:val="0"/>
+            <w:noProof/>
+            <w:kern w:val="2"/>
+            <w:sz w:val="24"/>
+            <w:szCs w:val="24"/>
+            <w14:ligatures w14:val="standardContextual"/>
+          </w:rPr>
+          <w:tab/>
+        </w:r>
+        <w:r>
+          <w:rPr>
+            <w:rStyle w:val="Lienhypertexte"/>
+            <w:noProof/>
+          </w:rPr>
+          <w:t>Bilan de la planification</w:t>
+        </w:r>
+        <w:r>
+          <w:rPr>
+            <w:noProof/>
+            <w:webHidden/>
+          </w:rPr>
+          <w:tab/>
+        </w:r>
+        <w:r>
+          <w:rPr>
+            <w:noProof/>
+            <w:webHidden/>
+          </w:rPr>
+          <w:fldChar w:fldCharType="begin"/>
+        </w:r>
+        <w:r>
+          <w:rPr>
+            <w:noProof/>
+            <w:webHidden/>
+          </w:rPr>
+          <w:instrText xml:space="preserve"> PAGEREF _Toc240008389 \h </w:instrText>
+        </w:r>
+        <w:r>
+          <w:rPr>
+            <w:noProof/>
+            <w:webHidden/>
+          </w:rPr>
+        </w:r>
+        <w:r>
+          <w:rPr>
+            <w:noProof/>
+            <w:webHidden/>
+          </w:rPr>
+          <w:fldChar w:fldCharType="separate"/>
+        </w:r>
+        <w:r>
+          <w:rPr>
+            <w:noProof/>
+            <w:webHidden/>
+          </w:rPr>
+          <w:t>3</w:t>
+        </w:r>
+        <w:r>
+          <w:rPr>
+            <w:noProof/>
+            <w:webHidden/>
+          </w:rPr>
+          <w:fldChar w:fldCharType="end"/>
+        </w:r>
+      </w:hyperlink>
+    </w:p>
+    <w:p>
+      <w:pPr>
+        <w:pStyle w:val="TM2"/>
+        <w:tabs>
+          <w:tab w:val="left" w:pos="800"/>
+          <w:tab w:val="right" w:leader="dot" w:pos="9060"/>
+        </w:tabs>
+        <w:rPr>
+          <w:rFonts w:eastAsiaTheme="minorEastAsia" w:cstheme="minorBidi"/>
+          <w:smallCaps w:val="0"/>
+          <w:noProof/>
+          <w:kern w:val="2"/>
+          <w:sz w:val="24"/>
+          <w:szCs w:val="24"/>
+          <w14:ligatures w14:val="standardContextual"/>
+        </w:rPr>
+      </w:pPr>
+      <w:hyperlink w:anchor="_Toc240008390" w:history="1">
+        <w:r>
+          <w:rPr>
+            <w:rStyle w:val="Lienhypertexte"/>
+            <w:noProof/>
+          </w:rPr>
+          <w:t>5.3</w:t>
+        </w:r>
+        <w:r>
+          <w:rPr>
+            <w:rFonts w:eastAsiaTheme="minorEastAsia" w:cstheme="minorBidi"/>
+            <w:smallCaps w:val="0"/>
+            <w:noProof/>
+            <w:kern w:val="2"/>
+            <w:sz w:val="24"/>
+            <w:szCs w:val="24"/>
+            <w14:ligatures w14:val="standardContextual"/>
+          </w:rPr>
+          <w:tab/>
+        </w:r>
+        <w:r>
+          <w:rPr>
+            <w:rStyle w:val="Lienhypertexte"/>
+            <w:noProof/>
+          </w:rPr>
+          <w:t>Bilan personnel</w:t>
+        </w:r>
+        <w:r>
+          <w:rPr>
+            <w:noProof/>
+            <w:webHidden/>
+          </w:rPr>
+          <w:tab/>
+        </w:r>
+        <w:r>
+          <w:rPr>
+            <w:noProof/>
+            <w:webHidden/>
+          </w:rPr>
+          <w:fldChar w:fldCharType="begin"/>
+        </w:r>
+        <w:r>
+          <w:rPr>
+            <w:noProof/>
+            <w:webHidden/>
+          </w:rPr>
+          <w:instrText xml:space="preserve"> PAGEREF _Toc240008390 \h </w:instrText>
+        </w:r>
+        <w:r>
+          <w:rPr>
+            <w:noProof/>
+            <w:webHidden/>
+          </w:rPr>
+        </w:r>
+        <w:r>
+          <w:rPr>
+            <w:noProof/>
+            <w:webHidden/>
+          </w:rPr>
+          <w:fldChar w:fldCharType="separate"/>
+        </w:r>
+        <w:r>
+          <w:rPr>
+            <w:noProof/>
+            <w:webHidden/>
+          </w:rPr>
+          <w:t>3</w:t>
         </w:r>
         <w:r>
           <w:rPr>
@@ -2563,11 +1149,13 @@
           <w:bCs w:val="0"/>
           <w:caps w:val="0"/>
           <w:noProof/>
-          <w:sz w:val="22"/>
-          <w:szCs w:val="22"/>
+          <w:kern w:val="2"/>
+          <w:sz w:val="24"/>
+          <w:szCs w:val="24"/>
+          <w14:ligatures w14:val="standardContextual"/>
         </w:rPr>
       </w:pPr>
-      <w:hyperlink w:anchor="_Toc308526342" w:history="1">
+      <w:hyperlink w:anchor="_Toc240008391" w:history="1">
         <w:r>
           <w:rPr>
             <w:rStyle w:val="Lienhypertexte"/>
@@ -2582,8 +1170,10 @@
             <w:bCs w:val="0"/>
             <w:caps w:val="0"/>
             <w:noProof/>
-            <w:sz w:val="22"/>
-            <w:szCs w:val="22"/>
+            <w:kern w:val="2"/>
+            <w:sz w:val="24"/>
+            <w:szCs w:val="24"/>
+            <w14:ligatures w14:val="standardContextual"/>
           </w:rPr>
           <w:tab/>
         </w:r>
@@ -2592,7 +1182,7 @@
             <w:rStyle w:val="Lienhypertexte"/>
             <w:noProof/>
           </w:rPr>
-          <w:t>Conclusion</w:t>
+          <w:t>Divers</w:t>
         </w:r>
         <w:r>
           <w:rPr>
@@ -2613,7 +1203,7 @@
             <w:noProof/>
             <w:webHidden/>
           </w:rPr>
-          <w:instrText xml:space="preserve"> PAGEREF _Toc308526342 \h </w:instrText>
+          <w:instrText xml:space="preserve"> PAGEREF _Toc240008391 \h </w:instrText>
         </w:r>
         <w:r>
           <w:rPr>
@@ -2633,7 +1223,7 @@
             <w:noProof/>
             <w:webHidden/>
           </w:rPr>
-          <w:t>5</w:t>
+          <w:t>4</w:t>
         </w:r>
         <w:r>
           <w:rPr>
@@ -2655,11 +1245,13 @@
           <w:rFonts w:eastAsiaTheme="minorEastAsia" w:cstheme="minorBidi"/>
           <w:smallCaps w:val="0"/>
           <w:noProof/>
-          <w:sz w:val="22"/>
-          <w:szCs w:val="22"/>
+          <w:kern w:val="2"/>
+          <w:sz w:val="24"/>
+          <w:szCs w:val="24"/>
+          <w14:ligatures w14:val="standardContextual"/>
         </w:rPr>
       </w:pPr>
-      <w:hyperlink w:anchor="_Toc308526343" w:history="1">
+      <w:hyperlink w:anchor="_Toc240008392" w:history="1">
         <w:r>
           <w:rPr>
             <w:rStyle w:val="Lienhypertexte"/>
@@ -2672,8 +1264,10 @@
             <w:rFonts w:eastAsiaTheme="minorEastAsia" w:cstheme="minorBidi"/>
             <w:smallCaps w:val="0"/>
             <w:noProof/>
-            <w:sz w:val="22"/>
-            <w:szCs w:val="22"/>
+            <w:kern w:val="2"/>
+            <w:sz w:val="24"/>
+            <w:szCs w:val="24"/>
+            <w14:ligatures w14:val="standardContextual"/>
           </w:rPr>
           <w:tab/>
         </w:r>
@@ -2682,7 +1276,7 @@
             <w:rStyle w:val="Lienhypertexte"/>
             <w:noProof/>
           </w:rPr>
-          <w:t>Bilan des fonctionnalités demandées</w:t>
+          <w:t>IA</w:t>
         </w:r>
         <w:r>
           <w:rPr>
@@ -2703,7 +1297,7 @@
             <w:noProof/>
             <w:webHidden/>
           </w:rPr>
-          <w:instrText xml:space="preserve"> PAGEREF _Toc308526343 \h </w:instrText>
+          <w:instrText xml:space="preserve"> PAGEREF _Toc240008392 \h </w:instrText>
         </w:r>
         <w:r>
           <w:rPr>
@@ -2723,7 +1317,7 @@
             <w:noProof/>
             <w:webHidden/>
           </w:rPr>
-          <w:t>5</w:t>
+          <w:t>4</w:t>
         </w:r>
         <w:r>
           <w:rPr>
@@ -2745,11 +1339,13 @@
           <w:rFonts w:eastAsiaTheme="minorEastAsia" w:cstheme="minorBidi"/>
           <w:smallCaps w:val="0"/>
           <w:noProof/>
-          <w:sz w:val="22"/>
-          <w:szCs w:val="22"/>
+          <w:kern w:val="2"/>
+          <w:sz w:val="24"/>
+          <w:szCs w:val="24"/>
+          <w14:ligatures w14:val="standardContextual"/>
         </w:rPr>
       </w:pPr>
-      <w:hyperlink w:anchor="_Toc308526344" w:history="1">
+      <w:hyperlink w:anchor="_Toc240008393" w:history="1">
         <w:r>
           <w:rPr>
             <w:rStyle w:val="Lienhypertexte"/>
@@ -2762,8 +1358,10 @@
             <w:rFonts w:eastAsiaTheme="minorEastAsia" w:cstheme="minorBidi"/>
             <w:smallCaps w:val="0"/>
             <w:noProof/>
-            <w:sz w:val="22"/>
-            <w:szCs w:val="22"/>
+            <w:kern w:val="2"/>
+            <w:sz w:val="24"/>
+            <w:szCs w:val="24"/>
+            <w14:ligatures w14:val="standardContextual"/>
           </w:rPr>
           <w:tab/>
         </w:r>
@@ -2772,7 +1370,7 @@
             <w:rStyle w:val="Lienhypertexte"/>
             <w:noProof/>
           </w:rPr>
-          <w:t>Bilan de la planification</w:t>
+          <w:t>Webographie</w:t>
         </w:r>
         <w:r>
           <w:rPr>
@@ -2793,7 +1391,7 @@
             <w:noProof/>
             <w:webHidden/>
           </w:rPr>
-          <w:instrText xml:space="preserve"> PAGEREF _Toc308526344 \h </w:instrText>
+          <w:instrText xml:space="preserve"> PAGEREF _Toc240008393 \h </w:instrText>
         </w:r>
         <w:r>
           <w:rPr>
@@ -2813,97 +1411,7 @@
             <w:noProof/>
             <w:webHidden/>
           </w:rPr>
-          <w:t>5</w:t>
-        </w:r>
-        <w:r>
-          <w:rPr>
-            <w:noProof/>
-            <w:webHidden/>
-          </w:rPr>
-          <w:fldChar w:fldCharType="end"/>
-        </w:r>
-      </w:hyperlink>
-    </w:p>
-    <w:p>
-      <w:pPr>
-        <w:pStyle w:val="TM2"/>
-        <w:tabs>
-          <w:tab w:val="left" w:pos="800"/>
-          <w:tab w:val="right" w:leader="dot" w:pos="9060"/>
-        </w:tabs>
-        <w:rPr>
-          <w:rFonts w:eastAsiaTheme="minorEastAsia" w:cstheme="minorBidi"/>
-          <w:smallCaps w:val="0"/>
-          <w:noProof/>
-          <w:sz w:val="22"/>
-          <w:szCs w:val="22"/>
-        </w:rPr>
-      </w:pPr>
-      <w:hyperlink w:anchor="_Toc308526345" w:history="1">
-        <w:r>
-          <w:rPr>
-            <w:rStyle w:val="Lienhypertexte"/>
-            <w:noProof/>
-          </w:rPr>
-          <w:t>6.3</w:t>
-        </w:r>
-        <w:r>
-          <w:rPr>
-            <w:rFonts w:eastAsiaTheme="minorEastAsia" w:cstheme="minorBidi"/>
-            <w:smallCaps w:val="0"/>
-            <w:noProof/>
-            <w:sz w:val="22"/>
-            <w:szCs w:val="22"/>
-          </w:rPr>
-          <w:tab/>
-        </w:r>
-        <w:r>
-          <w:rPr>
-            <w:rStyle w:val="Lienhypertexte"/>
-            <w:noProof/>
-          </w:rPr>
-          <w:t>Bilan personnel</w:t>
-        </w:r>
-        <w:r>
-          <w:rPr>
-            <w:noProof/>
-            <w:webHidden/>
-          </w:rPr>
-          <w:tab/>
-        </w:r>
-        <w:r>
-          <w:rPr>
-            <w:noProof/>
-            <w:webHidden/>
-          </w:rPr>
-          <w:fldChar w:fldCharType="begin"/>
-        </w:r>
-        <w:r>
-          <w:rPr>
-            <w:noProof/>
-            <w:webHidden/>
-          </w:rPr>
-          <w:instrText xml:space="preserve"> PAGEREF _Toc308526345 \h </w:instrText>
-        </w:r>
-        <w:r>
-          <w:rPr>
-            <w:noProof/>
-            <w:webHidden/>
-          </w:rPr>
-        </w:r>
-        <w:r>
-          <w:rPr>
-            <w:noProof/>
-            <w:webHidden/>
-          </w:rPr>
-          <w:fldChar w:fldCharType="separate"/>
-        </w:r>
-        <w:r>
-          <w:rPr>
-            <w:noProof/>
-            <w:webHidden/>
-          </w:rPr>
-          <w:t>5</w:t>
+          <w:t>4</w:t>
         </w:r>
         <w:r>
           <w:rPr>
@@ -2927,11 +1435,13 @@
           <w:bCs w:val="0"/>
           <w:caps w:val="0"/>
           <w:noProof/>
-          <w:sz w:val="22"/>
-          <w:szCs w:val="22"/>
+          <w:kern w:val="2"/>
+          <w:sz w:val="24"/>
+          <w:szCs w:val="24"/>
+          <w14:ligatures w14:val="standardContextual"/>
         </w:rPr>
       </w:pPr>
-      <w:hyperlink w:anchor="_Toc308526346" w:history="1">
+      <w:hyperlink w:anchor="_Toc240008394" w:history="1">
         <w:r>
           <w:rPr>
             <w:rStyle w:val="Lienhypertexte"/>
@@ -2946,8 +1456,10 @@
             <w:bCs w:val="0"/>
             <w:caps w:val="0"/>
             <w:noProof/>
-            <w:sz w:val="22"/>
-            <w:szCs w:val="22"/>
+            <w:kern w:val="2"/>
+            <w:sz w:val="24"/>
+            <w:szCs w:val="24"/>
+            <w14:ligatures w14:val="standardContextual"/>
           </w:rPr>
           <w:tab/>
         </w:r>
@@ -2956,7 +1468,7 @@
             <w:rStyle w:val="Lienhypertexte"/>
             <w:noProof/>
           </w:rPr>
-          <w:t>Divers</w:t>
+          <w:t>Annexes</w:t>
         </w:r>
         <w:r>
           <w:rPr>
@@ -2977,7 +1489,7 @@
             <w:noProof/>
             <w:webHidden/>
           </w:rPr>
-          <w:instrText xml:space="preserve"> PAGEREF _Toc308526346 \h </w:instrText>
+          <w:instrText xml:space="preserve"> PAGEREF _Toc240008394 \h </w:instrText>
         </w:r>
         <w:r>
           <w:rPr>
@@ -2997,371 +1509,7 @@
             <w:noProof/>
             <w:webHidden/>
           </w:rPr>
-          <w:t>6</w:t>
-        </w:r>
-        <w:r>
-          <w:rPr>
-            <w:noProof/>
-            <w:webHidden/>
-          </w:rPr>
-          <w:fldChar w:fldCharType="end"/>
-        </w:r>
-      </w:hyperlink>
-    </w:p>
-    <w:p>
-      <w:pPr>
-        <w:pStyle w:val="TM2"/>
-        <w:tabs>
-          <w:tab w:val="left" w:pos="800"/>
-          <w:tab w:val="right" w:leader="dot" w:pos="9060"/>
-        </w:tabs>
-        <w:rPr>
-          <w:rFonts w:eastAsiaTheme="minorEastAsia" w:cstheme="minorBidi"/>
-          <w:smallCaps w:val="0"/>
-          <w:noProof/>
-          <w:sz w:val="22"/>
-          <w:szCs w:val="22"/>
-        </w:rPr>
-      </w:pPr>
-      <w:hyperlink w:anchor="_Toc308526347" w:history="1">
-        <w:r>
-          <w:rPr>
-            <w:rStyle w:val="Lienhypertexte"/>
-            <w:noProof/>
-          </w:rPr>
-          <w:t>7.1</w:t>
-        </w:r>
-        <w:r>
-          <w:rPr>
-            <w:rFonts w:eastAsiaTheme="minorEastAsia" w:cstheme="minorBidi"/>
-            <w:smallCaps w:val="0"/>
-            <w:noProof/>
-            <w:sz w:val="22"/>
-            <w:szCs w:val="22"/>
-          </w:rPr>
-          <w:tab/>
-        </w:r>
-        <w:r>
-          <w:rPr>
-            <w:rStyle w:val="Lienhypertexte"/>
-            <w:noProof/>
-          </w:rPr>
-          <w:t>Journal de travail</w:t>
-        </w:r>
-        <w:r>
-          <w:rPr>
-            <w:noProof/>
-            <w:webHidden/>
-          </w:rPr>
-          <w:tab/>
-        </w:r>
-        <w:r>
-          <w:rPr>
-            <w:noProof/>
-            <w:webHidden/>
-          </w:rPr>
-          <w:fldChar w:fldCharType="begin"/>
-        </w:r>
-        <w:r>
-          <w:rPr>
-            <w:noProof/>
-            <w:webHidden/>
-          </w:rPr>
-          <w:instrText xml:space="preserve"> PAGEREF _Toc308526347 \h </w:instrText>
-        </w:r>
-        <w:r>
-          <w:rPr>
-            <w:noProof/>
-            <w:webHidden/>
-          </w:rPr>
-        </w:r>
-        <w:r>
-          <w:rPr>
-            <w:noProof/>
-            <w:webHidden/>
-          </w:rPr>
-          <w:fldChar w:fldCharType="separate"/>
-        </w:r>
-        <w:r>
-          <w:rPr>
-            <w:noProof/>
-            <w:webHidden/>
-          </w:rPr>
-          <w:t>6</w:t>
-        </w:r>
-        <w:r>
-          <w:rPr>
-            <w:noProof/>
-            <w:webHidden/>
-          </w:rPr>
-          <w:fldChar w:fldCharType="end"/>
-        </w:r>
-      </w:hyperlink>
-    </w:p>
-    <w:p>
-      <w:pPr>
-        <w:pStyle w:val="TM2"/>
-        <w:tabs>
-          <w:tab w:val="left" w:pos="800"/>
-          <w:tab w:val="right" w:leader="dot" w:pos="9060"/>
-        </w:tabs>
-        <w:rPr>
-          <w:rFonts w:eastAsiaTheme="minorEastAsia" w:cstheme="minorBidi"/>
-          <w:smallCaps w:val="0"/>
-          <w:noProof/>
-          <w:sz w:val="22"/>
-          <w:szCs w:val="22"/>
-        </w:rPr>
-      </w:pPr>
-      <w:hyperlink w:anchor="_Toc308526348" w:history="1">
-        <w:r>
-          <w:rPr>
-            <w:rStyle w:val="Lienhypertexte"/>
-            <w:noProof/>
-          </w:rPr>
-          <w:t>7.2</w:t>
-        </w:r>
-        <w:r>
-          <w:rPr>
-            <w:rFonts w:eastAsiaTheme="minorEastAsia" w:cstheme="minorBidi"/>
-            <w:smallCaps w:val="0"/>
-            <w:noProof/>
-            <w:sz w:val="22"/>
-            <w:szCs w:val="22"/>
-          </w:rPr>
-          <w:tab/>
-        </w:r>
-        <w:r>
-          <w:rPr>
-            <w:rStyle w:val="Lienhypertexte"/>
-            <w:noProof/>
-          </w:rPr>
-          <w:t>Bibliographie</w:t>
-        </w:r>
-        <w:r>
-          <w:rPr>
-            <w:noProof/>
-            <w:webHidden/>
-          </w:rPr>
-          <w:tab/>
-        </w:r>
-        <w:r>
-          <w:rPr>
-            <w:noProof/>
-            <w:webHidden/>
-          </w:rPr>
-          <w:fldChar w:fldCharType="begin"/>
-        </w:r>
-        <w:r>
-          <w:rPr>
-            <w:noProof/>
-            <w:webHidden/>
-          </w:rPr>
-          <w:instrText xml:space="preserve"> PAGEREF _Toc308526348 \h </w:instrText>
-        </w:r>
-        <w:r>
-          <w:rPr>
-            <w:noProof/>
-            <w:webHidden/>
-          </w:rPr>
-        </w:r>
-        <w:r>
-          <w:rPr>
-            <w:noProof/>
-            <w:webHidden/>
-          </w:rPr>
-          <w:fldChar w:fldCharType="separate"/>
-        </w:r>
-        <w:r>
-          <w:rPr>
-            <w:noProof/>
-            <w:webHidden/>
-          </w:rPr>
-          <w:t>6</w:t>
-        </w:r>
-        <w:r>
-          <w:rPr>
-            <w:noProof/>
-            <w:webHidden/>
-          </w:rPr>
-          <w:fldChar w:fldCharType="end"/>
-        </w:r>
-      </w:hyperlink>
-    </w:p>
-    <w:p>
-      <w:pPr>
-        <w:pStyle w:val="TM2"/>
-        <w:tabs>
-          <w:tab w:val="left" w:pos="800"/>
-          <w:tab w:val="right" w:leader="dot" w:pos="9060"/>
-        </w:tabs>
-        <w:rPr>
-          <w:rFonts w:eastAsiaTheme="minorEastAsia" w:cstheme="minorBidi"/>
-          <w:smallCaps w:val="0"/>
-          <w:noProof/>
-          <w:sz w:val="22"/>
-          <w:szCs w:val="22"/>
-        </w:rPr>
-      </w:pPr>
-      <w:hyperlink w:anchor="_Toc308526349" w:history="1">
-        <w:r>
-          <w:rPr>
-            <w:rStyle w:val="Lienhypertexte"/>
-            <w:noProof/>
-          </w:rPr>
-          <w:t>7.3</w:t>
-        </w:r>
-        <w:r>
-          <w:rPr>
-            <w:rFonts w:eastAsiaTheme="minorEastAsia" w:cstheme="minorBidi"/>
-            <w:smallCaps w:val="0"/>
-            <w:noProof/>
-            <w:sz w:val="22"/>
-            <w:szCs w:val="22"/>
-          </w:rPr>
-          <w:tab/>
-        </w:r>
-        <w:r>
-          <w:rPr>
-            <w:rStyle w:val="Lienhypertexte"/>
-            <w:noProof/>
-          </w:rPr>
-          <w:t>Webographie</w:t>
-        </w:r>
-        <w:r>
-          <w:rPr>
-            <w:noProof/>
-            <w:webHidden/>
-          </w:rPr>
-          <w:tab/>
-        </w:r>
-        <w:r>
-          <w:rPr>
-            <w:noProof/>
-            <w:webHidden/>
-          </w:rPr>
-          <w:fldChar w:fldCharType="begin"/>
-        </w:r>
-        <w:r>
-          <w:rPr>
-            <w:noProof/>
-            <w:webHidden/>
-          </w:rPr>
-          <w:instrText xml:space="preserve"> PAGEREF _Toc308526349 \h </w:instrText>
-        </w:r>
-        <w:r>
-          <w:rPr>
-            <w:noProof/>
-            <w:webHidden/>
-          </w:rPr>
-        </w:r>
-        <w:r>
-          <w:rPr>
-            <w:noProof/>
-            <w:webHidden/>
-          </w:rPr>
-          <w:fldChar w:fldCharType="separate"/>
-        </w:r>
-        <w:r>
-          <w:rPr>
-            <w:noProof/>
-            <w:webHidden/>
-          </w:rPr>
-          <w:t>6</w:t>
-        </w:r>
-        <w:r>
-          <w:rPr>
-            <w:noProof/>
-            <w:webHidden/>
-          </w:rPr>
-          <w:fldChar w:fldCharType="end"/>
-        </w:r>
-      </w:hyperlink>
-    </w:p>
-    <w:p>
-      <w:pPr>
-        <w:pStyle w:val="TM10"/>
-        <w:tabs>
-          <w:tab w:val="left" w:pos="400"/>
-          <w:tab w:val="right" w:leader="dot" w:pos="9060"/>
-        </w:tabs>
-        <w:rPr>
-          <w:rFonts w:eastAsiaTheme="minorEastAsia" w:cstheme="minorBidi"/>
-          <w:b w:val="0"/>
-          <w:bCs w:val="0"/>
-          <w:caps w:val="0"/>
-          <w:noProof/>
-          <w:sz w:val="22"/>
-          <w:szCs w:val="22"/>
-        </w:rPr>
-      </w:pPr>
-      <w:hyperlink w:anchor="_Toc308526350" w:history="1">
-        <w:r>
-          <w:rPr>
-            <w:rStyle w:val="Lienhypertexte"/>
-            <w:noProof/>
-          </w:rPr>
-          <w:t>8</w:t>
-        </w:r>
-        <w:r>
-          <w:rPr>
-            <w:rFonts w:eastAsiaTheme="minorEastAsia" w:cstheme="minorBidi"/>
-            <w:b w:val="0"/>
-            <w:bCs w:val="0"/>
-            <w:caps w:val="0"/>
-            <w:noProof/>
-            <w:sz w:val="22"/>
-            <w:szCs w:val="22"/>
-          </w:rPr>
-          <w:tab/>
-        </w:r>
-        <w:r>
-          <w:rPr>
-            <w:rStyle w:val="Lienhypertexte"/>
-            <w:noProof/>
-          </w:rPr>
-          <w:t>Annexes</w:t>
-        </w:r>
-        <w:r>
-          <w:rPr>
-            <w:noProof/>
-            <w:webHidden/>
-          </w:rPr>
-          <w:tab/>
-        </w:r>
-        <w:r>
-          <w:rPr>
-            <w:noProof/>
-            <w:webHidden/>
-          </w:rPr>
-          <w:fldChar w:fldCharType="begin"/>
-        </w:r>
-        <w:r>
-          <w:rPr>
-            <w:noProof/>
-            <w:webHidden/>
-          </w:rPr>
-          <w:instrText xml:space="preserve"> PAGEREF _Toc308526350 \h </w:instrText>
-        </w:r>
-        <w:r>
-          <w:rPr>
-            <w:noProof/>
-            <w:webHidden/>
-          </w:rPr>
-        </w:r>
-        <w:r>
-          <w:rPr>
-            <w:noProof/>
-            <w:webHidden/>
-          </w:rPr>
-          <w:fldChar w:fldCharType="separate"/>
-        </w:r>
-        <w:r>
-          <w:rPr>
-            <w:noProof/>
-            <w:webHidden/>
-          </w:rPr>
-          <w:t>6</w:t>
+          <w:t>4</w:t>
         </w:r>
         <w:r>
           <w:rPr>
@@ -3392,80 +1540,424 @@
       <w:pPr>
         <w:pStyle w:val="Titre1"/>
       </w:pPr>
-      <w:bookmarkStart w:id="0" w:name="_Toc532179969"/>
-      <w:bookmarkStart w:id="1" w:name="_Toc165969639"/>
-      <w:bookmarkStart w:id="2" w:name="_Toc308526331"/>
       <w:r>
         <w:lastRenderedPageBreak/>
-        <w:t>Planification</w:t>
+        <w:t>Inttroduction</w:t>
+      </w:r>
+    </w:p>
+    <w:p>
+      <w:pPr>
+        <w:pStyle w:val="Titre2"/>
+      </w:pPr>
+      <w:r>
+        <w:t>Objectifs produit</w:t>
+      </w:r>
+    </w:p>
+    <w:p>
+      <w:pPr>
+        <w:pStyle w:val="Corpsdetexte"/>
+        <w:ind w:left="708"/>
+      </w:pPr>
+      <w:r>
+        <w:t>L’objectif du projet et de développer une simulation de parking où l’utilisateur pourra voir l’état du parking avec toutes les informations sur le parking, les places totales, occupées, libre, un plan pour pouvoir savoir exactement quelle place et libre ou non et aussi une liste des véhicules présent avec leur plaque et le temps d’occupation. En plus de ça, il y aura aussi un menu qui permettra à l’utilisateur d’afficher différentes informations et aussi de faire entrer ou sortir des véhicules.</w:t>
+      </w:r>
+    </w:p>
+    <w:p>
+      <w:pPr>
+        <w:pStyle w:val="Titre2"/>
+      </w:pPr>
+      <w:r>
+        <w:t>Objectifs pédagogiques</w:t>
+      </w:r>
+    </w:p>
+    <w:p>
+      <w:pPr>
+        <w:pStyle w:val="Corpsdetexte"/>
+        <w:ind w:left="708"/>
+      </w:pPr>
+      <w:r>
+        <w:t>Le projet</w:t>
+      </w:r>
+      <w:r>
+        <w:t xml:space="preserve"> me permettra de perfectionner mes connaissances en programmation orienté objet, comme la structuration ou l’encapsulation qui ne sont pas mes points forts pour l’instant. En plus de cela, j’apprendrai à faire des tests unitaires mais aussi de perfectionner mon workflow avec GitHub en utilisant plusieurs branches et en faisant des commits les plus atomiques possible.</w:t>
+      </w:r>
+    </w:p>
+    <w:p>
+      <w:pPr>
+        <w:pStyle w:val="Titre2"/>
+      </w:pPr>
+      <w:r>
+        <w:t>Source de données</w:t>
+      </w:r>
+    </w:p>
+    <w:p>
+      <w:pPr>
+        <w:pStyle w:val="Titre3"/>
+      </w:pPr>
+      <w:r>
+        <w:t>Voiture</w:t>
+      </w:r>
+    </w:p>
+    <w:p>
+      <w:pPr>
+        <w:pStyle w:val="Retraitcorpsdetexte3"/>
+        <w:numPr>
+          <w:ilvl w:val="0"/>
+          <w:numId w:val="49"/>
+        </w:numPr>
+      </w:pPr>
+      <w:r>
+        <w:t>Plaque d’immatriculation (string)</w:t>
+      </w:r>
+    </w:p>
+    <w:p>
+      <w:pPr>
+        <w:pStyle w:val="Retraitcorpsdetexte3"/>
+        <w:numPr>
+          <w:ilvl w:val="0"/>
+          <w:numId w:val="49"/>
+        </w:numPr>
+      </w:pPr>
+      <w:r>
+        <w:t>Place attitré (Objet dans liste d’objet)</w:t>
+      </w:r>
+    </w:p>
+    <w:p>
+      <w:pPr>
+        <w:pStyle w:val="Retraitcorpsdetexte3"/>
+        <w:numPr>
+          <w:ilvl w:val="0"/>
+          <w:numId w:val="49"/>
+        </w:numPr>
+      </w:pPr>
+      <w:r>
+        <w:rPr>
+          <w:highlight w:val="yellow"/>
+        </w:rPr>
+        <w:t>T</w:t>
+      </w:r>
+      <w:r>
+        <w:t>icket at</w:t>
+      </w:r>
+      <w:r>
+        <w:t>t</w:t>
+      </w:r>
+      <w:r>
+        <w:t>itré (Objet)</w:t>
+      </w:r>
+    </w:p>
+    <w:p>
+      <w:pPr>
+        <w:pStyle w:val="Titre3"/>
+      </w:pPr>
+      <w:r>
+        <w:t>Place</w:t>
+      </w:r>
+    </w:p>
+    <w:p>
+      <w:pPr>
+        <w:pStyle w:val="Retraitcorpsdetexte3"/>
+        <w:numPr>
+          <w:ilvl w:val="0"/>
+          <w:numId w:val="49"/>
+        </w:numPr>
+      </w:pPr>
+      <w:r>
+        <w:t>Numéro de place (int)</w:t>
+      </w:r>
+    </w:p>
+    <w:p>
+      <w:pPr>
+        <w:pStyle w:val="Retraitcorpsdetexte3"/>
+        <w:numPr>
+          <w:ilvl w:val="0"/>
+          <w:numId w:val="49"/>
+        </w:numPr>
+      </w:pPr>
+      <w:r>
+        <w:t>Occupation (bool)</w:t>
+      </w:r>
+    </w:p>
+    <w:p>
+      <w:pPr>
+        <w:pStyle w:val="Titre3"/>
+      </w:pPr>
+      <w:r>
+        <w:t>Ticket</w:t>
+      </w:r>
+    </w:p>
+    <w:p>
+      <w:pPr>
+        <w:pStyle w:val="Retraitcorpsdetexte3"/>
+        <w:numPr>
+          <w:ilvl w:val="0"/>
+          <w:numId w:val="49"/>
+        </w:numPr>
+      </w:pPr>
+      <w:r>
+        <w:t>Heure d’arrivé</w:t>
+      </w:r>
+    </w:p>
+    <w:p>
+      <w:pPr>
+        <w:pStyle w:val="Retraitcorpsdetexte3"/>
+        <w:numPr>
+          <w:ilvl w:val="0"/>
+          <w:numId w:val="49"/>
+        </w:numPr>
+      </w:pPr>
+      <w:r>
+        <w:t>Heure de sortie</w:t>
+      </w:r>
+    </w:p>
+    <w:p>
+      <w:pPr>
+        <w:pStyle w:val="Retraitcorpsdetexte3"/>
+        <w:numPr>
+          <w:ilvl w:val="0"/>
+          <w:numId w:val="49"/>
+        </w:numPr>
+      </w:pPr>
+      <w:r>
+        <w:t>Montant à payé</w:t>
+      </w:r>
+    </w:p>
+    <w:p>
+      <w:pPr>
+        <w:pStyle w:val="Titre3"/>
+      </w:pPr>
+      <w:r>
+        <w:t>Parking</w:t>
+      </w:r>
+    </w:p>
+    <w:p>
+      <w:pPr>
+        <w:pStyle w:val="Retraitcorpsdetexte3"/>
+        <w:numPr>
+          <w:ilvl w:val="0"/>
+          <w:numId w:val="49"/>
+        </w:numPr>
+      </w:pPr>
+      <w:r>
+        <w:t>Voitures (Liste d’objet)</w:t>
+      </w:r>
+    </w:p>
+    <w:p>
+      <w:pPr>
+        <w:pStyle w:val="Retraitcorpsdetexte3"/>
+        <w:numPr>
+          <w:ilvl w:val="0"/>
+          <w:numId w:val="49"/>
+        </w:numPr>
+      </w:pPr>
+      <w:r>
+        <w:t>Places (Liste d’objet)</w:t>
+      </w:r>
+    </w:p>
+    <w:p>
+      <w:pPr>
+        <w:rPr>
+          <w:szCs w:val="16"/>
+        </w:rPr>
+      </w:pPr>
+      <w:r>
+        <w:br w:type="page"/>
+      </w:r>
+    </w:p>
+    <w:p>
+      <w:pPr>
+        <w:pStyle w:val="Titre1"/>
+      </w:pPr>
+      <w:bookmarkStart w:id="0" w:name="_Toc532179957"/>
+      <w:bookmarkStart w:id="1" w:name="_Toc165969641"/>
+      <w:bookmarkStart w:id="2" w:name="_Toc240008382"/>
+      <w:r>
+        <w:lastRenderedPageBreak/>
+        <w:t>Analyse</w:t>
       </w:r>
       <w:bookmarkEnd w:id="0"/>
       <w:bookmarkEnd w:id="1"/>
-      <w:r>
-        <w:t xml:space="preserve"> Initiale</w:t>
-      </w:r>
       <w:bookmarkEnd w:id="2"/>
     </w:p>
     <w:p>
       <w:pPr>
-        <w:pStyle w:val="Informations"/>
+        <w:pStyle w:val="Titre2"/>
+      </w:pPr>
+      <w:r>
+        <w:t>User Stories</w:t>
+      </w:r>
+    </w:p>
+    <w:p>
+      <w:pPr>
+        <w:pStyle w:val="Retraitcorpsdetexte"/>
+      </w:pPr>
+      <w:r>
+        <w:t>En tant que [gérant du parking], je veux [action] afin de [bénéfice]</w:t>
+      </w:r>
+    </w:p>
+    <w:p>
+      <w:pPr>
+        <w:pStyle w:val="Titre3"/>
+      </w:pPr>
+      <w:r>
+        <w:t>Entrée d’un véhicule</w:t>
+      </w:r>
+    </w:p>
+    <w:p>
+      <w:pPr>
+        <w:pStyle w:val="Retraitcorpsdetexte"/>
         <w:numPr>
-          <w:ilvl w:val="5"/>
-          <w:numId w:val="26"/>
+          <w:ilvl w:val="0"/>
+          <w:numId w:val="49"/>
         </w:numPr>
       </w:pPr>
       <w:r>
-        <w:t>Ce paragraphe présente le p</w:t>
-      </w:r>
-      <w:r>
-        <w:t>lanning d'origine (</w:t>
-      </w:r>
-      <w:r>
-        <w:t xml:space="preserve">date de début, date de fin, vacances et congés, </w:t>
-      </w:r>
-      <w:r>
-        <w:t xml:space="preserve">liste hiérarchique des tâches ou </w:t>
-      </w:r>
-      <w:r>
-        <w:t>GANTT</w:t>
-      </w:r>
-      <w:r>
-        <w:t>, jalons, durée totale</w:t>
-      </w:r>
-      <w:r>
-        <w:t>)</w:t>
-      </w:r>
-    </w:p>
-    <w:p>
-      <w:pPr>
-        <w:pStyle w:val="Informations"/>
+        <w:t>En tant que conducteur, je veux obtenir une place automatiquement afin de ne pas avoir besoins de chercher une place disponible.</w:t>
+      </w:r>
+    </w:p>
+    <w:p>
+      <w:pPr>
+        <w:pStyle w:val="Titre3"/>
+      </w:pPr>
+      <w:r>
+        <w:t>Sortie d’un véhicule</w:t>
+      </w:r>
+    </w:p>
+    <w:p>
+      <w:pPr>
+        <w:pStyle w:val="Retraitcorpsdetexte3"/>
         <w:numPr>
-          <w:ilvl w:val="5"/>
-          <w:numId w:val="26"/>
+          <w:ilvl w:val="0"/>
+          <w:numId w:val="49"/>
         </w:numPr>
       </w:pPr>
       <w:r>
-        <w:t xml:space="preserve">Toutes les mises à jour subies par le planning </w:t>
-      </w:r>
-      <w:r>
-        <w:t xml:space="preserve">sont à reporter </w:t>
-      </w:r>
-      <w:r>
-        <w:t>(avec date de mise à jour)</w:t>
-      </w:r>
-      <w:r>
-        <w:t xml:space="preserve"> et peuvent déboucher sur plusieurs versions de plannings.</w:t>
-      </w:r>
+        <w:t xml:space="preserve">En tant que conducteur, je veux savoir si la plaque attribuer à la place et bien la mienne afin d’être </w:t>
+      </w:r>
+      <w:r>
+        <w:t>sûr</w:t>
+      </w:r>
+      <w:r>
+        <w:t xml:space="preserve"> de payer le montant pour ma voiture et pas celle d’une autre personne.</w:t>
+      </w:r>
+    </w:p>
+    <w:p>
+      <w:pPr>
+        <w:pStyle w:val="Titre3"/>
+      </w:pPr>
+      <w:r>
+        <w:t>Afficher l’état du parking</w:t>
+      </w:r>
+    </w:p>
+    <w:p>
+      <w:pPr>
+        <w:pStyle w:val="Titre3"/>
+        <w:numPr>
+          <w:ilvl w:val="0"/>
+          <w:numId w:val="49"/>
+        </w:numPr>
+        <w:rPr>
+          <w:sz w:val="20"/>
+          <w:szCs w:val="20"/>
+        </w:rPr>
+      </w:pPr>
+      <w:r>
+        <w:rPr>
+          <w:sz w:val="20"/>
+          <w:szCs w:val="20"/>
+        </w:rPr>
+        <w:t>En</w:t>
+      </w:r>
+      <w:r>
+        <w:rPr>
+          <w:sz w:val="20"/>
+          <w:szCs w:val="20"/>
+        </w:rPr>
+        <w:t xml:space="preserve"> tant que gérant du parking, je veux pouvoir voir un plan du parking afin de connaitre les places occupées ou non.</w:t>
+      </w:r>
+    </w:p>
+    <w:p>
+      <w:pPr>
+        <w:pStyle w:val="Retraitcorpsdetexte3"/>
+        <w:numPr>
+          <w:ilvl w:val="0"/>
+          <w:numId w:val="49"/>
+        </w:numPr>
+      </w:pPr>
+      <w:r>
+        <w:t>En tant que conducteur, je veux pouvoir connaitre le taux d’occupation du parking afin de savoir si je peux encore me parquer ou pas.</w:t>
+      </w:r>
+    </w:p>
+    <w:p>
+      <w:pPr>
+        <w:pStyle w:val="Titre3"/>
+      </w:pPr>
+      <w:r>
+        <w:t>Rechercher un véhicule</w:t>
+      </w:r>
+    </w:p>
+    <w:p>
+      <w:pPr>
+        <w:pStyle w:val="Retraitcorpsdetexte3"/>
+        <w:numPr>
+          <w:ilvl w:val="0"/>
+          <w:numId w:val="49"/>
+        </w:numPr>
+      </w:pPr>
+      <w:r>
+        <w:t>En tant que conducteur, je veux pouvoir effectuer une recherche avec ma plaque afin d’obtenir la place ou je suis parqué.</w:t>
+      </w:r>
+    </w:p>
+    <w:p>
+      <w:pPr>
+        <w:pStyle w:val="Titre3"/>
+      </w:pPr>
+      <w:r>
+        <w:t>Statistique du jour</w:t>
+      </w:r>
+    </w:p>
+    <w:p>
+      <w:pPr>
+        <w:pStyle w:val="Retraitcorpsdetexte3"/>
+        <w:numPr>
+          <w:ilvl w:val="0"/>
+          <w:numId w:val="49"/>
+        </w:numPr>
+      </w:pPr>
+      <w:r>
+        <w:t>En tant que gérant du parking, je veux que les montants de tous les tickets s’additionnent automatiquement afin de connaitre mon chiffre d’affaires du jour.</w:t>
+      </w:r>
+    </w:p>
+    <w:p>
+      <w:pPr>
+        <w:pStyle w:val="Titre3"/>
+      </w:pPr>
+      <w:r>
+        <w:t>Historiques des transactions</w:t>
+      </w:r>
+    </w:p>
+    <w:p>
+      <w:pPr>
+        <w:pStyle w:val="Retraitcorpsdetexte3"/>
+      </w:pPr>
+      <w:r>
+        <w:t>En tant que gérant du parking, je veux connaitre l’heure d’arrivé et de sortie de tous les véhicule afin de d’avoir un historique en cas de problème.</w:t>
+      </w:r>
+    </w:p>
+    <w:p>
+      <w:pPr>
+        <w:pStyle w:val="Corpsdetexte"/>
+      </w:pPr>
     </w:p>
     <w:p>
       <w:pPr>
         <w:pStyle w:val="Titre1"/>
       </w:pPr>
-      <w:bookmarkStart w:id="3" w:name="_Toc532179957"/>
-      <w:bookmarkStart w:id="4" w:name="_Toc165969641"/>
-      <w:bookmarkStart w:id="5" w:name="_Toc308526332"/>
-      <w:r>
-        <w:t>Analyse</w:t>
+      <w:bookmarkStart w:id="3" w:name="_Toc532179964"/>
+      <w:bookmarkStart w:id="4" w:name="_Toc165969648"/>
+      <w:bookmarkStart w:id="5" w:name="_Toc240008383"/>
+      <w:r>
+        <w:t>Réalisation</w:t>
       </w:r>
       <w:bookmarkEnd w:id="3"/>
       <w:bookmarkEnd w:id="4"/>
@@ -3473,36 +1965,17 @@
     </w:p>
     <w:p>
       <w:pPr>
-        <w:pStyle w:val="Corpsdetexte"/>
-      </w:pPr>
-    </w:p>
-    <w:p>
-      <w:pPr>
-        <w:pStyle w:val="Titre1"/>
-      </w:pPr>
-      <w:bookmarkStart w:id="6" w:name="_Toc532179964"/>
-      <w:bookmarkStart w:id="7" w:name="_Toc165969648"/>
-      <w:bookmarkStart w:id="8" w:name="_Toc308526337"/>
-      <w:r>
-        <w:t>Réalisation</w:t>
+        <w:pStyle w:val="Titre2"/>
+      </w:pPr>
+      <w:bookmarkStart w:id="6" w:name="_Toc532179965"/>
+      <w:bookmarkStart w:id="7" w:name="_Toc165969649"/>
+      <w:bookmarkStart w:id="8" w:name="_Toc240008384"/>
+      <w:r>
+        <w:t>Dossier de Réalisation</w:t>
       </w:r>
       <w:bookmarkEnd w:id="6"/>
       <w:bookmarkEnd w:id="7"/>
       <w:bookmarkEnd w:id="8"/>
-    </w:p>
-    <w:p>
-      <w:pPr>
-        <w:pStyle w:val="Titre2"/>
-      </w:pPr>
-      <w:bookmarkStart w:id="9" w:name="_Toc532179965"/>
-      <w:bookmarkStart w:id="10" w:name="_Toc165969649"/>
-      <w:bookmarkStart w:id="11" w:name="_Toc308526338"/>
-      <w:r>
-        <w:t>Dossier de Réalisation</w:t>
-      </w:r>
-      <w:bookmarkEnd w:id="9"/>
-      <w:bookmarkEnd w:id="10"/>
-      <w:bookmarkEnd w:id="11"/>
     </w:p>
     <w:p>
       <w:pPr>
@@ -3661,31 +2134,31 @@
       <w:pPr>
         <w:pStyle w:val="Titre1"/>
       </w:pPr>
-      <w:bookmarkStart w:id="12" w:name="_Toc532179966"/>
-      <w:bookmarkStart w:id="13" w:name="_Toc165969650"/>
-      <w:bookmarkStart w:id="14" w:name="_Toc308526340"/>
+      <w:bookmarkStart w:id="9" w:name="_Toc532179966"/>
+      <w:bookmarkStart w:id="10" w:name="_Toc165969650"/>
+      <w:bookmarkStart w:id="11" w:name="_Toc240008385"/>
       <w:r>
         <w:t>Tests</w:t>
+      </w:r>
+      <w:bookmarkEnd w:id="9"/>
+      <w:bookmarkEnd w:id="10"/>
+      <w:bookmarkEnd w:id="11"/>
+    </w:p>
+    <w:p>
+      <w:pPr>
+        <w:pStyle w:val="Titre2"/>
+      </w:pPr>
+      <w:bookmarkStart w:id="12" w:name="_Toc532179968"/>
+      <w:bookmarkStart w:id="13" w:name="_Toc165969652"/>
+      <w:bookmarkStart w:id="14" w:name="_Ref308525868"/>
+      <w:bookmarkStart w:id="15" w:name="_Toc240008386"/>
+      <w:r>
+        <w:t>Dossier des tests</w:t>
       </w:r>
       <w:bookmarkEnd w:id="12"/>
       <w:bookmarkEnd w:id="13"/>
       <w:bookmarkEnd w:id="14"/>
-    </w:p>
-    <w:p>
-      <w:pPr>
-        <w:pStyle w:val="Titre2"/>
-      </w:pPr>
-      <w:bookmarkStart w:id="15" w:name="_Toc532179968"/>
-      <w:bookmarkStart w:id="16" w:name="_Toc165969652"/>
-      <w:bookmarkStart w:id="17" w:name="_Ref308525868"/>
-      <w:bookmarkStart w:id="18" w:name="_Toc308526341"/>
-      <w:r>
-        <w:t>Dossier des tests</w:t>
-      </w:r>
       <w:bookmarkEnd w:id="15"/>
-      <w:bookmarkEnd w:id="16"/>
-      <w:bookmarkEnd w:id="17"/>
-      <w:bookmarkEnd w:id="18"/>
     </w:p>
     <w:p>
       <w:pPr>
@@ -3759,6 +2232,7 @@
         </w:numPr>
       </w:pPr>
       <w:r>
+        <w:lastRenderedPageBreak/>
         <w:t>Corrigé</w:t>
       </w:r>
       <w:r>
@@ -3772,28 +2246,28 @@
       <w:pPr>
         <w:pStyle w:val="Titre1"/>
       </w:pPr>
-      <w:bookmarkStart w:id="19" w:name="_Toc165969653"/>
-      <w:bookmarkStart w:id="20" w:name="_Toc308526342"/>
+      <w:bookmarkStart w:id="16" w:name="_Toc165969653"/>
+      <w:bookmarkStart w:id="17" w:name="_Toc240008387"/>
       <w:r>
         <w:t>Conclusion</w:t>
       </w:r>
+      <w:bookmarkEnd w:id="16"/>
+      <w:bookmarkEnd w:id="17"/>
+    </w:p>
+    <w:p>
+      <w:pPr>
+        <w:pStyle w:val="Titre2"/>
+      </w:pPr>
+      <w:bookmarkStart w:id="18" w:name="_Toc165969654"/>
+      <w:bookmarkStart w:id="19" w:name="_Toc240008388"/>
+      <w:r>
+        <w:t xml:space="preserve">Bilan des </w:t>
+      </w:r>
+      <w:bookmarkEnd w:id="18"/>
+      <w:r>
+        <w:t>fonctionnalités demandées</w:t>
+      </w:r>
       <w:bookmarkEnd w:id="19"/>
-      <w:bookmarkEnd w:id="20"/>
-    </w:p>
-    <w:p>
-      <w:pPr>
-        <w:pStyle w:val="Titre2"/>
-      </w:pPr>
-      <w:bookmarkStart w:id="21" w:name="_Toc165969654"/>
-      <w:bookmarkStart w:id="22" w:name="_Toc308526343"/>
-      <w:r>
-        <w:t xml:space="preserve">Bilan des </w:t>
-      </w:r>
-      <w:bookmarkEnd w:id="21"/>
-      <w:r>
-        <w:t>fonctionnalités demandées</w:t>
-      </w:r>
-      <w:bookmarkEnd w:id="22"/>
     </w:p>
     <w:p>
       <w:pPr>
@@ -3832,13 +2306,13 @@
       <w:pPr>
         <w:pStyle w:val="Titre2"/>
       </w:pPr>
-      <w:bookmarkStart w:id="23" w:name="_Toc165969655"/>
-      <w:bookmarkStart w:id="24" w:name="_Toc308526344"/>
+      <w:bookmarkStart w:id="20" w:name="_Toc165969655"/>
+      <w:bookmarkStart w:id="21" w:name="_Toc240008389"/>
       <w:r>
         <w:t>Bilan de la planification</w:t>
       </w:r>
-      <w:bookmarkEnd w:id="23"/>
-      <w:bookmarkEnd w:id="24"/>
+      <w:bookmarkEnd w:id="20"/>
+      <w:bookmarkEnd w:id="21"/>
     </w:p>
     <w:p>
       <w:pPr>
@@ -3871,13 +2345,13 @@
       <w:pPr>
         <w:pStyle w:val="Titre2"/>
       </w:pPr>
-      <w:bookmarkStart w:id="25" w:name="_Toc165969656"/>
-      <w:bookmarkStart w:id="26" w:name="_Toc308526345"/>
+      <w:bookmarkStart w:id="22" w:name="_Toc165969656"/>
+      <w:bookmarkStart w:id="23" w:name="_Toc240008390"/>
       <w:r>
         <w:t>Bilan personnel</w:t>
       </w:r>
-      <w:bookmarkEnd w:id="25"/>
-      <w:bookmarkEnd w:id="26"/>
+      <w:bookmarkEnd w:id="22"/>
+      <w:bookmarkEnd w:id="23"/>
     </w:p>
     <w:p>
       <w:pPr>
@@ -3979,33 +2453,35 @@
       <w:pPr>
         <w:pStyle w:val="Titre1"/>
       </w:pPr>
-      <w:bookmarkStart w:id="27" w:name="_Toc532179971"/>
-      <w:bookmarkStart w:id="28" w:name="_Toc165969657"/>
-      <w:bookmarkStart w:id="29" w:name="_Toc308526346"/>
+      <w:bookmarkStart w:id="24" w:name="_Toc532179971"/>
+      <w:bookmarkStart w:id="25" w:name="_Toc165969657"/>
+      <w:bookmarkStart w:id="26" w:name="_Toc240008391"/>
       <w:r>
         <w:t>Divers</w:t>
       </w:r>
+      <w:bookmarkEnd w:id="24"/>
+      <w:bookmarkEnd w:id="25"/>
+      <w:bookmarkEnd w:id="26"/>
+    </w:p>
+    <w:p>
+      <w:pPr>
+        <w:pStyle w:val="Titre2"/>
+      </w:pPr>
+      <w:bookmarkStart w:id="27" w:name="_Toc240008392"/>
+      <w:r>
+        <w:t>IA</w:t>
+      </w:r>
       <w:bookmarkEnd w:id="27"/>
+    </w:p>
+    <w:p>
+      <w:pPr>
+        <w:pStyle w:val="Titre2"/>
+      </w:pPr>
+      <w:bookmarkStart w:id="28" w:name="_Toc240008393"/>
+      <w:r>
+        <w:t>Webographie</w:t>
+      </w:r>
       <w:bookmarkEnd w:id="28"/>
-      <w:bookmarkEnd w:id="29"/>
-    </w:p>
-    <w:p>
-      <w:pPr>
-        <w:pStyle w:val="Titre2"/>
-      </w:pPr>
-      <w:r>
-        <w:t>IA</w:t>
-      </w:r>
-    </w:p>
-    <w:p>
-      <w:pPr>
-        <w:pStyle w:val="Titre2"/>
-      </w:pPr>
-      <w:bookmarkStart w:id="30" w:name="_Toc308526349"/>
-      <w:r>
-        <w:t>Webographie</w:t>
-      </w:r>
-      <w:bookmarkEnd w:id="30"/>
     </w:p>
     <w:p>
       <w:pPr>
@@ -4023,12 +2499,11 @@
       <w:pPr>
         <w:pStyle w:val="Titre1"/>
       </w:pPr>
-      <w:bookmarkStart w:id="31" w:name="_Toc308526350"/>
-      <w:r>
-        <w:lastRenderedPageBreak/>
+      <w:bookmarkStart w:id="29" w:name="_Toc240008394"/>
+      <w:r>
         <w:t>Annexes</w:t>
       </w:r>
-      <w:bookmarkEnd w:id="31"/>
+      <w:bookmarkEnd w:id="29"/>
     </w:p>
     <w:p>
       <w:pPr>
@@ -4535,7 +3010,7 @@
               <w:noProof/>
               <w:szCs w:val="16"/>
             </w:rPr>
-            <w:t>00.00.0000 00:00</w:t>
+            <w:t>28.08.2026 11:19</w:t>
           </w:r>
           <w:r>
             <w:rPr>
@@ -6038,6 +4513,119 @@
     </w:lvl>
   </w:abstractNum>
   <w:abstractNum w:abstractNumId="20" w15:restartNumberingAfterBreak="0">
+    <w:nsid w:val="24627036"/>
+    <w:multiLevelType w:val="hybridMultilevel"/>
+    <w:tmpl w:val="D86055DE"/>
+    <w:lvl w:ilvl="0" w:tplc="4348B4CE">
+      <w:start w:val="7"/>
+      <w:numFmt w:val="bullet"/>
+      <w:lvlText w:val="-"/>
+      <w:lvlJc w:val="left"/>
+      <w:pPr>
+        <w:ind w:left="2174" w:hanging="360"/>
+      </w:pPr>
+      <w:rPr>
+        <w:rFonts w:ascii="Century Gothic" w:eastAsia="Times New Roman" w:hAnsi="Century Gothic" w:cs="Times New Roman" w:hint="default"/>
+      </w:rPr>
+    </w:lvl>
+    <w:lvl w:ilvl="1" w:tplc="100C0003" w:tentative="1">
+      <w:start w:val="1"/>
+      <w:numFmt w:val="bullet"/>
+      <w:lvlText w:val="o"/>
+      <w:lvlJc w:val="left"/>
+      <w:pPr>
+        <w:ind w:left="2894" w:hanging="360"/>
+      </w:pPr>
+      <w:rPr>
+        <w:rFonts w:ascii="Courier New" w:hAnsi="Courier New" w:cs="Courier New" w:hint="default"/>
+      </w:rPr>
+    </w:lvl>
+    <w:lvl w:ilvl="2" w:tplc="100C0005" w:tentative="1">
+      <w:start w:val="1"/>
+      <w:numFmt w:val="bullet"/>
+      <w:lvlText w:val=""/>
+      <w:lvlJc w:val="left"/>
+      <w:pPr>
+        <w:ind w:left="3614" w:hanging="360"/>
+      </w:pPr>
+      <w:rPr>
+        <w:rFonts w:ascii="Wingdings" w:hAnsi="Wingdings" w:hint="default"/>
+      </w:rPr>
+    </w:lvl>
+    <w:lvl w:ilvl="3" w:tplc="100C0001" w:tentative="1">
+      <w:start w:val="1"/>
+      <w:numFmt w:val="bullet"/>
+      <w:lvlText w:val=""/>
+      <w:lvlJc w:val="left"/>
+      <w:pPr>
+        <w:ind w:left="4334" w:hanging="360"/>
+      </w:pPr>
+      <w:rPr>
+        <w:rFonts w:ascii="Symbol" w:hAnsi="Symbol" w:hint="default"/>
+      </w:rPr>
+    </w:lvl>
+    <w:lvl w:ilvl="4" w:tplc="100C0003" w:tentative="1">
+      <w:start w:val="1"/>
+      <w:numFmt w:val="bullet"/>
+      <w:lvlText w:val="o"/>
+      <w:lvlJc w:val="left"/>
+      <w:pPr>
+        <w:ind w:left="5054" w:hanging="360"/>
+      </w:pPr>
+      <w:rPr>
+        <w:rFonts w:ascii="Courier New" w:hAnsi="Courier New" w:cs="Courier New" w:hint="default"/>
+      </w:rPr>
+    </w:lvl>
+    <w:lvl w:ilvl="5" w:tplc="100C0005" w:tentative="1">
+      <w:start w:val="1"/>
+      <w:numFmt w:val="bullet"/>
+      <w:lvlText w:val=""/>
+      <w:lvlJc w:val="left"/>
+      <w:pPr>
+        <w:ind w:left="5774" w:hanging="360"/>
+      </w:pPr>
+      <w:rPr>
+        <w:rFonts w:ascii="Wingdings" w:hAnsi="Wingdings" w:hint="default"/>
+      </w:rPr>
+    </w:lvl>
+    <w:lvl w:ilvl="6" w:tplc="100C0001" w:tentative="1">
+      <w:start w:val="1"/>
+      <w:numFmt w:val="bullet"/>
+      <w:lvlText w:val=""/>
+      <w:lvlJc w:val="left"/>
+      <w:pPr>
+        <w:ind w:left="6494" w:hanging="360"/>
+      </w:pPr>
+      <w:rPr>
+        <w:rFonts w:ascii="Symbol" w:hAnsi="Symbol" w:hint="default"/>
+      </w:rPr>
+    </w:lvl>
+    <w:lvl w:ilvl="7" w:tplc="100C0003" w:tentative="1">
+      <w:start w:val="1"/>
+      <w:numFmt w:val="bullet"/>
+      <w:lvlText w:val="o"/>
+      <w:lvlJc w:val="left"/>
+      <w:pPr>
+        <w:ind w:left="7214" w:hanging="360"/>
+      </w:pPr>
+      <w:rPr>
+        <w:rFonts w:ascii="Courier New" w:hAnsi="Courier New" w:cs="Courier New" w:hint="default"/>
+      </w:rPr>
+    </w:lvl>
+    <w:lvl w:ilvl="8" w:tplc="100C0005" w:tentative="1">
+      <w:start w:val="1"/>
+      <w:numFmt w:val="bullet"/>
+      <w:lvlText w:val=""/>
+      <w:lvlJc w:val="left"/>
+      <w:pPr>
+        <w:ind w:left="7934" w:hanging="360"/>
+      </w:pPr>
+      <w:rPr>
+        <w:rFonts w:ascii="Wingdings" w:hAnsi="Wingdings" w:hint="default"/>
+      </w:rPr>
+    </w:lvl>
+  </w:abstractNum>
+  <w:abstractNum w:abstractNumId="21" w15:restartNumberingAfterBreak="0">
     <w:nsid w:val="2A8F67FD"/>
     <w:multiLevelType w:val="multilevel"/>
     <w:tmpl w:val="08EA5668"/>
@@ -6180,7 +4768,7 @@
       </w:rPr>
     </w:lvl>
   </w:abstractNum>
-  <w:abstractNum w:abstractNumId="21" w15:restartNumberingAfterBreak="0">
+  <w:abstractNum w:abstractNumId="22" w15:restartNumberingAfterBreak="0">
     <w:nsid w:val="2F2C5963"/>
     <w:multiLevelType w:val="multilevel"/>
     <w:tmpl w:val="E2569098"/>
@@ -6293,7 +4881,7 @@
       </w:pPr>
     </w:lvl>
   </w:abstractNum>
-  <w:abstractNum w:abstractNumId="22" w15:restartNumberingAfterBreak="0">
+  <w:abstractNum w:abstractNumId="23" w15:restartNumberingAfterBreak="0">
     <w:nsid w:val="36506853"/>
     <w:multiLevelType w:val="multilevel"/>
     <w:tmpl w:val="2F6EF210"/>
@@ -6406,7 +4994,7 @@
       </w:rPr>
     </w:lvl>
   </w:abstractNum>
-  <w:abstractNum w:abstractNumId="23" w15:restartNumberingAfterBreak="0">
+  <w:abstractNum w:abstractNumId="24" w15:restartNumberingAfterBreak="0">
     <w:nsid w:val="3BD16F36"/>
     <w:multiLevelType w:val="multilevel"/>
     <w:tmpl w:val="100C0021"/>
@@ -6519,7 +5107,7 @@
       </w:rPr>
     </w:lvl>
   </w:abstractNum>
-  <w:abstractNum w:abstractNumId="24" w15:restartNumberingAfterBreak="0">
+  <w:abstractNum w:abstractNumId="25" w15:restartNumberingAfterBreak="0">
     <w:nsid w:val="3C361DED"/>
     <w:multiLevelType w:val="multilevel"/>
     <w:tmpl w:val="100C0021"/>
@@ -6632,7 +5220,7 @@
       </w:rPr>
     </w:lvl>
   </w:abstractNum>
-  <w:abstractNum w:abstractNumId="25" w15:restartNumberingAfterBreak="0">
+  <w:abstractNum w:abstractNumId="26" w15:restartNumberingAfterBreak="0">
     <w:nsid w:val="3EF922F0"/>
     <w:multiLevelType w:val="multilevel"/>
     <w:tmpl w:val="100C0021"/>
@@ -6745,7 +5333,7 @@
       </w:rPr>
     </w:lvl>
   </w:abstractNum>
-  <w:abstractNum w:abstractNumId="26" w15:restartNumberingAfterBreak="0">
+  <w:abstractNum w:abstractNumId="27" w15:restartNumberingAfterBreak="0">
     <w:nsid w:val="486164F4"/>
     <w:multiLevelType w:val="multilevel"/>
     <w:tmpl w:val="100C0021"/>
@@ -6858,7 +5446,7 @@
       </w:rPr>
     </w:lvl>
   </w:abstractNum>
-  <w:abstractNum w:abstractNumId="27" w15:restartNumberingAfterBreak="0">
+  <w:abstractNum w:abstractNumId="28" w15:restartNumberingAfterBreak="0">
     <w:nsid w:val="4C4E14AC"/>
     <w:multiLevelType w:val="multilevel"/>
     <w:tmpl w:val="100C001F"/>
@@ -6944,7 +5532,7 @@
       </w:pPr>
     </w:lvl>
   </w:abstractNum>
-  <w:abstractNum w:abstractNumId="28" w15:restartNumberingAfterBreak="0">
+  <w:abstractNum w:abstractNumId="29" w15:restartNumberingAfterBreak="0">
     <w:nsid w:val="4D30734E"/>
     <w:multiLevelType w:val="multilevel"/>
     <w:tmpl w:val="100C001D"/>
@@ -7030,7 +5618,7 @@
       </w:pPr>
     </w:lvl>
   </w:abstractNum>
-  <w:abstractNum w:abstractNumId="29" w15:restartNumberingAfterBreak="0">
+  <w:abstractNum w:abstractNumId="30" w15:restartNumberingAfterBreak="0">
     <w:nsid w:val="55FE2729"/>
     <w:multiLevelType w:val="multilevel"/>
     <w:tmpl w:val="100C0023"/>
@@ -7117,7 +5705,7 @@
       </w:pPr>
     </w:lvl>
   </w:abstractNum>
-  <w:abstractNum w:abstractNumId="30" w15:restartNumberingAfterBreak="0">
+  <w:abstractNum w:abstractNumId="31" w15:restartNumberingAfterBreak="0">
     <w:nsid w:val="58933B2A"/>
     <w:multiLevelType w:val="multilevel"/>
     <w:tmpl w:val="100C0021"/>
@@ -7230,7 +5818,7 @@
       </w:rPr>
     </w:lvl>
   </w:abstractNum>
-  <w:abstractNum w:abstractNumId="31" w15:restartNumberingAfterBreak="0">
+  <w:abstractNum w:abstractNumId="32" w15:restartNumberingAfterBreak="0">
     <w:nsid w:val="5C877673"/>
     <w:multiLevelType w:val="multilevel"/>
     <w:tmpl w:val="100C0021"/>
@@ -7343,7 +5931,7 @@
       </w:rPr>
     </w:lvl>
   </w:abstractNum>
-  <w:abstractNum w:abstractNumId="32" w15:restartNumberingAfterBreak="0">
+  <w:abstractNum w:abstractNumId="33" w15:restartNumberingAfterBreak="0">
     <w:nsid w:val="5CBC53EC"/>
     <w:multiLevelType w:val="multilevel"/>
     <w:tmpl w:val="2F6EF210"/>
@@ -7456,7 +6044,7 @@
       </w:rPr>
     </w:lvl>
   </w:abstractNum>
-  <w:abstractNum w:abstractNumId="33" w15:restartNumberingAfterBreak="0">
+  <w:abstractNum w:abstractNumId="34" w15:restartNumberingAfterBreak="0">
     <w:nsid w:val="5E424682"/>
     <w:multiLevelType w:val="multilevel"/>
     <w:tmpl w:val="100C001F"/>
@@ -7542,7 +6130,7 @@
       </w:pPr>
     </w:lvl>
   </w:abstractNum>
-  <w:abstractNum w:abstractNumId="34" w15:restartNumberingAfterBreak="0">
+  <w:abstractNum w:abstractNumId="35" w15:restartNumberingAfterBreak="0">
     <w:nsid w:val="63A9062F"/>
     <w:multiLevelType w:val="multilevel"/>
     <w:tmpl w:val="DCCE794A"/>
@@ -7682,7 +6270,7 @@
       </w:rPr>
     </w:lvl>
   </w:abstractNum>
-  <w:abstractNum w:abstractNumId="35" w15:restartNumberingAfterBreak="0">
+  <w:abstractNum w:abstractNumId="36" w15:restartNumberingAfterBreak="0">
     <w:nsid w:val="643F0961"/>
     <w:multiLevelType w:val="multilevel"/>
     <w:tmpl w:val="100C0021"/>
@@ -7795,7 +6383,7 @@
       </w:rPr>
     </w:lvl>
   </w:abstractNum>
-  <w:abstractNum w:abstractNumId="36" w15:restartNumberingAfterBreak="0">
+  <w:abstractNum w:abstractNumId="37" w15:restartNumberingAfterBreak="0">
     <w:nsid w:val="65512774"/>
     <w:multiLevelType w:val="hybridMultilevel"/>
     <w:tmpl w:val="FA9840BE"/>
@@ -7908,7 +6496,7 @@
       </w:rPr>
     </w:lvl>
   </w:abstractNum>
-  <w:abstractNum w:abstractNumId="37" w15:restartNumberingAfterBreak="0">
+  <w:abstractNum w:abstractNumId="38" w15:restartNumberingAfterBreak="0">
     <w:nsid w:val="6D6476B9"/>
     <w:multiLevelType w:val="multilevel"/>
     <w:tmpl w:val="100C0023"/>
@@ -7995,7 +6583,7 @@
       </w:pPr>
     </w:lvl>
   </w:abstractNum>
-  <w:abstractNum w:abstractNumId="38" w15:restartNumberingAfterBreak="0">
+  <w:abstractNum w:abstractNumId="39" w15:restartNumberingAfterBreak="0">
     <w:nsid w:val="70C03573"/>
     <w:multiLevelType w:val="multilevel"/>
     <w:tmpl w:val="100C0021"/>
@@ -8108,7 +6696,7 @@
       </w:rPr>
     </w:lvl>
   </w:abstractNum>
-  <w:abstractNum w:abstractNumId="39" w15:restartNumberingAfterBreak="0">
+  <w:abstractNum w:abstractNumId="40" w15:restartNumberingAfterBreak="0">
     <w:nsid w:val="79CD09A9"/>
     <w:multiLevelType w:val="multilevel"/>
     <w:tmpl w:val="100C0021"/>
@@ -8221,7 +6809,7 @@
       </w:rPr>
     </w:lvl>
   </w:abstractNum>
-  <w:abstractNum w:abstractNumId="40" w15:restartNumberingAfterBreak="0">
+  <w:abstractNum w:abstractNumId="41" w15:restartNumberingAfterBreak="0">
     <w:nsid w:val="7E7F1C51"/>
     <w:multiLevelType w:val="multilevel"/>
     <w:tmpl w:val="100C0021"/>
@@ -8344,10 +6932,10 @@
     <w:abstractNumId w:val="15"/>
   </w:num>
   <w:num w:numId="4" w16cid:durableId="596405975">
-    <w:abstractNumId w:val="34"/>
+    <w:abstractNumId w:val="35"/>
   </w:num>
   <w:num w:numId="5" w16cid:durableId="463159420">
-    <w:abstractNumId w:val="34"/>
+    <w:abstractNumId w:val="35"/>
   </w:num>
   <w:num w:numId="6" w16cid:durableId="323052918">
     <w:abstractNumId w:val="15"/>
@@ -8362,16 +6950,16 @@
     <w:abstractNumId w:val="15"/>
   </w:num>
   <w:num w:numId="10" w16cid:durableId="1658024676">
-    <w:abstractNumId w:val="34"/>
+    <w:abstractNumId w:val="35"/>
   </w:num>
   <w:num w:numId="11" w16cid:durableId="1224103078">
     <w:abstractNumId w:val="15"/>
   </w:num>
   <w:num w:numId="12" w16cid:durableId="1351755406">
-    <w:abstractNumId w:val="21"/>
+    <w:abstractNumId w:val="22"/>
   </w:num>
   <w:num w:numId="13" w16cid:durableId="2052072547">
-    <w:abstractNumId w:val="20"/>
+    <w:abstractNumId w:val="21"/>
   </w:num>
   <w:num w:numId="14" w16cid:durableId="1186165081">
     <w:abstractNumId w:val="19"/>
@@ -8380,28 +6968,28 @@
     <w:abstractNumId w:val="16"/>
   </w:num>
   <w:num w:numId="16" w16cid:durableId="516965254">
-    <w:abstractNumId w:val="31"/>
+    <w:abstractNumId w:val="32"/>
   </w:num>
   <w:num w:numId="17" w16cid:durableId="1796024327">
-    <w:abstractNumId w:val="26"/>
+    <w:abstractNumId w:val="27"/>
   </w:num>
   <w:num w:numId="18" w16cid:durableId="1990403140">
-    <w:abstractNumId w:val="40"/>
+    <w:abstractNumId w:val="41"/>
   </w:num>
   <w:num w:numId="19" w16cid:durableId="1010833323">
-    <w:abstractNumId w:val="38"/>
+    <w:abstractNumId w:val="39"/>
   </w:num>
   <w:num w:numId="20" w16cid:durableId="2031568591">
     <w:abstractNumId w:val="10"/>
   </w:num>
   <w:num w:numId="21" w16cid:durableId="911505811">
-    <w:abstractNumId w:val="35"/>
+    <w:abstractNumId w:val="36"/>
   </w:num>
   <w:num w:numId="22" w16cid:durableId="1120495523">
-    <w:abstractNumId w:val="25"/>
+    <w:abstractNumId w:val="26"/>
   </w:num>
   <w:num w:numId="23" w16cid:durableId="696270620">
-    <w:abstractNumId w:val="23"/>
+    <w:abstractNumId w:val="24"/>
   </w:num>
   <w:num w:numId="24" w16cid:durableId="1348025824">
     <w:abstractNumId w:val="13"/>
@@ -8413,19 +7001,19 @@
     <w:abstractNumId w:val="12"/>
   </w:num>
   <w:num w:numId="27" w16cid:durableId="1056659923">
+    <w:abstractNumId w:val="31"/>
+  </w:num>
+  <w:num w:numId="28" w16cid:durableId="1532574879">
+    <w:abstractNumId w:val="34"/>
+  </w:num>
+  <w:num w:numId="29" w16cid:durableId="62261757">
+    <w:abstractNumId w:val="29"/>
+  </w:num>
+  <w:num w:numId="30" w16cid:durableId="1796941351">
     <w:abstractNumId w:val="30"/>
   </w:num>
-  <w:num w:numId="28" w16cid:durableId="1532574879">
-    <w:abstractNumId w:val="33"/>
-  </w:num>
-  <w:num w:numId="29" w16cid:durableId="62261757">
-    <w:abstractNumId w:val="28"/>
-  </w:num>
-  <w:num w:numId="30" w16cid:durableId="1796941351">
-    <w:abstractNumId w:val="29"/>
-  </w:num>
   <w:num w:numId="31" w16cid:durableId="514727322">
-    <w:abstractNumId w:val="37"/>
+    <w:abstractNumId w:val="38"/>
   </w:num>
   <w:num w:numId="32" w16cid:durableId="1954172953">
     <w:abstractNumId w:val="8"/>
@@ -8458,25 +7046,28 @@
     <w:abstractNumId w:val="4"/>
   </w:num>
   <w:num w:numId="42" w16cid:durableId="878662524">
-    <w:abstractNumId w:val="27"/>
+    <w:abstractNumId w:val="28"/>
   </w:num>
   <w:num w:numId="43" w16cid:durableId="883296572">
-    <w:abstractNumId w:val="24"/>
+    <w:abstractNumId w:val="25"/>
   </w:num>
   <w:num w:numId="44" w16cid:durableId="2109156932">
-    <w:abstractNumId w:val="39"/>
+    <w:abstractNumId w:val="40"/>
   </w:num>
   <w:num w:numId="45" w16cid:durableId="2037003398">
     <w:abstractNumId w:val="14"/>
   </w:num>
   <w:num w:numId="46" w16cid:durableId="74135675">
-    <w:abstractNumId w:val="22"/>
+    <w:abstractNumId w:val="23"/>
   </w:num>
   <w:num w:numId="47" w16cid:durableId="1232034242">
-    <w:abstractNumId w:val="32"/>
+    <w:abstractNumId w:val="33"/>
   </w:num>
   <w:num w:numId="48" w16cid:durableId="45959474">
-    <w:abstractNumId w:val="36"/>
+    <w:abstractNumId w:val="37"/>
+  </w:num>
+  <w:num w:numId="49" w16cid:durableId="1043942679">
+    <w:abstractNumId w:val="20"/>
   </w:num>
   <w:numIdMacAtCleanup w:val="4"/>
 </w:numbering>
@@ -8983,7 +7574,6 @@
   <w:style w:type="character" w:default="1" w:styleId="Policepardfaut">
     <w:name w:val="Default Paragraph Font"/>
     <w:uiPriority w:val="1"/>
-    <w:semiHidden/>
     <w:unhideWhenUsed/>
   </w:style>
   <w:style w:type="table" w:default="1" w:styleId="TableauNormal">
@@ -9171,7 +7761,6 @@
     <w:next w:val="Normal"/>
     <w:autoRedefine/>
     <w:uiPriority w:val="39"/>
-    <w:semiHidden/>
     <w:rsid w:val="00656974"/>
     <w:pPr>
       <w:spacing w:before="120" w:after="120"/>
@@ -9188,7 +7777,6 @@
     <w:next w:val="Normal"/>
     <w:autoRedefine/>
     <w:uiPriority w:val="39"/>
-    <w:semiHidden/>
     <w:rsid w:val="007F30AE"/>
     <w:pPr>
       <w:ind w:left="200"/>
@@ -9794,6 +8382,25 @@
 </file>
 
 <file path=customXml/item1.xml><?xml version="1.0" encoding="utf-8"?>
+<?mso-contentType ?>
+<FormTemplates xmlns="http://schemas.microsoft.com/sharepoint/v3/contenttype/forms">
+  <Display>DocumentLibraryForm</Display>
+  <Edit>DocumentLibraryForm</Edit>
+  <New>DocumentLibraryForm</New>
+</FormTemplates>
+</file>
+
+<file path=customXml/item2.xml><?xml version="1.0" encoding="utf-8"?>
+<b:Sources xmlns:b="http://schemas.openxmlformats.org/officeDocument/2006/bibliography" xmlns="http://schemas.openxmlformats.org/officeDocument/2006/bibliography" SelectedStyle="\APA.XSL" StyleName="APA"/>
+</file>
+
+<file path=customXml/item3.xml><?xml version="1.0" encoding="utf-8"?>
+<p:properties xmlns:p="http://schemas.microsoft.com/office/2006/metadata/properties" xmlns:xsi="http://www.w3.org/2001/XMLSchema-instance" xmlns:pc="http://schemas.microsoft.com/office/infopath/2007/PartnerControls">
+  <documentManagement/>
+</p:properties>
+</file>
+
+<file path=customXml/item4.xml><?xml version="1.0" encoding="utf-8"?>
 <ct:contentTypeSchema xmlns:ct="http://schemas.microsoft.com/office/2006/metadata/contentType" xmlns:ma="http://schemas.microsoft.com/office/2006/metadata/properties/metaAttributes" ct:_="" ma:_="" ma:contentTypeName="Document" ma:contentTypeID="0x010100FBB99F57F4D89D439F52EDCD0CED316B" ma:contentTypeVersion="7" ma:contentTypeDescription="Crée un document." ma:contentTypeScope="" ma:versionID="7f146099027e1b74c82fbe61e090590b">
   <xsd:schema xmlns:xsd="http://www.w3.org/2001/XMLSchema" xmlns:xs="http://www.w3.org/2001/XMLSchema" xmlns:p="http://schemas.microsoft.com/office/2006/metadata/properties" xmlns:ns2="6b19550a-bdc3-4796-8096-c6911560d534" targetNamespace="http://schemas.microsoft.com/office/2006/metadata/properties" ma:root="true" ma:fieldsID="7044bf5f632aa66a3f32a70d04b92caa" ns2:_="">
     <xsd:import namespace="6b19550a-bdc3-4796-8096-c6911560d534"/>
@@ -9955,26 +8562,32 @@
 </ct:contentTypeSchema>
 </file>
 
-<file path=customXml/item2.xml><?xml version="1.0" encoding="utf-8"?>
-<p:properties xmlns:p="http://schemas.microsoft.com/office/2006/metadata/properties" xmlns:xsi="http://www.w3.org/2001/XMLSchema-instance" xmlns:pc="http://schemas.microsoft.com/office/infopath/2007/PartnerControls">
-  <documentManagement/>
-</p:properties>
+<file path=customXml/itemProps1.xml><?xml version="1.0" encoding="utf-8"?>
+<ds:datastoreItem xmlns:ds="http://schemas.openxmlformats.org/officeDocument/2006/customXml" ds:itemID="{6C3F7A66-EDE3-46FD-83EB-3C265E5D2669}">
+  <ds:schemaRefs>
+    <ds:schemaRef ds:uri="http://schemas.microsoft.com/sharepoint/v3/contenttype/forms"/>
+  </ds:schemaRefs>
+</ds:datastoreItem>
 </file>
 
-<file path=customXml/item3.xml><?xml version="1.0" encoding="utf-8"?>
-<b:Sources xmlns:b="http://schemas.openxmlformats.org/officeDocument/2006/bibliography" xmlns="http://schemas.openxmlformats.org/officeDocument/2006/bibliography" SelectedStyle="\APA.XSL" StyleName="APA"/>
+<file path=customXml/itemProps2.xml><?xml version="1.0" encoding="utf-8"?>
+<ds:datastoreItem xmlns:ds="http://schemas.openxmlformats.org/officeDocument/2006/customXml" ds:itemID="{C8C35155-3E6A-4058-B6E4-303717845E3B}">
+  <ds:schemaRefs>
+    <ds:schemaRef ds:uri="http://schemas.openxmlformats.org/officeDocument/2006/bibliography"/>
+  </ds:schemaRefs>
+</ds:datastoreItem>
 </file>
 
-<file path=customXml/item4.xml><?xml version="1.0" encoding="utf-8"?>
-<?mso-contentType ?>
-<FormTemplates xmlns="http://schemas.microsoft.com/sharepoint/v3/contenttype/forms">
-  <Display>DocumentLibraryForm</Display>
-  <Edit>DocumentLibraryForm</Edit>
-  <New>DocumentLibraryForm</New>
-</FormTemplates>
+<file path=customXml/itemProps3.xml><?xml version="1.0" encoding="utf-8"?>
+<ds:datastoreItem xmlns:ds="http://schemas.openxmlformats.org/officeDocument/2006/customXml" ds:itemID="{2319CDB8-A2CD-412D-8359-13E6B4DF1FF4}">
+  <ds:schemaRefs>
+    <ds:schemaRef ds:uri="http://schemas.microsoft.com/office/2006/metadata/properties"/>
+    <ds:schemaRef ds:uri="http://schemas.microsoft.com/office/infopath/2007/PartnerControls"/>
+  </ds:schemaRefs>
+</ds:datastoreItem>
 </file>
 
-<file path=customXml/itemProps1.xml><?xml version="1.0" encoding="utf-8"?>
+<file path=customXml/itemProps4.xml><?xml version="1.0" encoding="utf-8"?>
 <ds:datastoreItem xmlns:ds="http://schemas.openxmlformats.org/officeDocument/2006/customXml" ds:itemID="{75ED066B-A5C4-4F00-9682-79C6BF6A6E3B}">
   <ds:schemaRefs>
     <ds:schemaRef ds:uri="http://schemas.microsoft.com/office/2006/metadata/contentType"/>
@@ -9990,29 +8603,4 @@
     <ds:schemaRef ds:uri="http://schemas.microsoft.com/internal/obd"/>
   </ds:schemaRefs>
 </ds:datastoreItem>
-</file>
-
-<file path=customXml/itemProps2.xml><?xml version="1.0" encoding="utf-8"?>
-<ds:datastoreItem xmlns:ds="http://schemas.openxmlformats.org/officeDocument/2006/customXml" ds:itemID="{2319CDB8-A2CD-412D-8359-13E6B4DF1FF4}">
-  <ds:schemaRefs>
-    <ds:schemaRef ds:uri="http://schemas.microsoft.com/office/2006/metadata/properties"/>
-    <ds:schemaRef ds:uri="http://schemas.microsoft.com/office/infopath/2007/PartnerControls"/>
-  </ds:schemaRefs>
-</ds:datastoreItem>
-</file>
-
-<file path=customXml/itemProps3.xml><?xml version="1.0" encoding="utf-8"?>
-<ds:datastoreItem xmlns:ds="http://schemas.openxmlformats.org/officeDocument/2006/customXml" ds:itemID="{C8C35155-3E6A-4058-B6E4-303717845E3B}">
-  <ds:schemaRefs>
-    <ds:schemaRef ds:uri="http://schemas.openxmlformats.org/officeDocument/2006/bibliography"/>
-  </ds:schemaRefs>
-</ds:datastoreItem>
-</file>
-
-<file path=customXml/itemProps4.xml><?xml version="1.0" encoding="utf-8"?>
-<ds:datastoreItem xmlns:ds="http://schemas.openxmlformats.org/officeDocument/2006/customXml" ds:itemID="{6C3F7A66-EDE3-46FD-83EB-3C265E5D2669}">
-  <ds:schemaRefs>
-    <ds:schemaRef ds:uri="http://schemas.microsoft.com/sharepoint/v3/contenttype/forms"/>
-  </ds:schemaRefs>
-</ds:datastoreItem>
 </file>
</xml_diff>